<commit_message>
update docs/fr documentation files
</commit_message>
<xml_diff>
--- a/docs/Fr/Blocs Ogma.docx
+++ b/docs/Fr/Blocs Ogma.docx
@@ -287,25 +287,18 @@
           <w:bottom w:val="single" w:sz="4" w:space="1" w:color="auto"/>
           <w:right w:val="single" w:sz="4" w:space="4" w:color="auto"/>
         </w:pBdr>
+        <w:rPr>
+          <w:lang w:val="en-GB"/>
+        </w:rPr>
       </w:pPr>
       <w:r>
         <w:t xml:space="preserve">    </w:t>
       </w:r>
-      <w:proofErr w:type="gramStart"/>
-      <w:r>
-        <w:t>let</w:t>
-      </w:r>
-      <w:proofErr w:type="gramEnd"/>
-      <w:r>
-        <w:t xml:space="preserve"> x = </w:t>
-      </w:r>
-      <w:proofErr w:type="spellStart"/>
-      <w:r>
-        <w:t>int</w:t>
-      </w:r>
-      <w:proofErr w:type="spellEnd"/>
-      <w:r>
-        <w:t xml:space="preserve"> 10</w:t>
+      <w:r>
+        <w:rPr>
+          <w:lang w:val="en-GB"/>
+        </w:rPr>
+        <w:t>let x = int 10</w:t>
       </w:r>
     </w:p>
     <w:p>
@@ -316,17 +309,15 @@
           <w:bottom w:val="single" w:sz="4" w:space="1" w:color="auto"/>
           <w:right w:val="single" w:sz="4" w:space="4" w:color="auto"/>
         </w:pBdr>
-      </w:pPr>
-      <w:r>
-        <w:t xml:space="preserve">    </w:t>
-      </w:r>
-      <w:proofErr w:type="gramStart"/>
-      <w:r>
-        <w:t>let</w:t>
-      </w:r>
-      <w:proofErr w:type="gramEnd"/>
-      <w:r>
-        <w:t xml:space="preserve"> y = x + 2</w:t>
+        <w:rPr>
+          <w:lang w:val="en-GB"/>
+        </w:rPr>
+      </w:pPr>
+      <w:r>
+        <w:rPr>
+          <w:lang w:val="en-GB"/>
+        </w:rPr>
+        <w:t xml:space="preserve">    let y = x + 2</w:t>
       </w:r>
     </w:p>
     <w:p>
@@ -339,6 +330,9 @@
         </w:pBdr>
       </w:pPr>
       <w:r>
+        <w:rPr>
+          <w:lang w:val="en-GB"/>
+        </w:rPr>
         <w:t xml:space="preserve">    </w:t>
       </w:r>
       <w:proofErr w:type="gramStart"/>
@@ -617,50 +611,74 @@
         <w:rPr>
           <w:b/>
           <w:bCs/>
-        </w:rPr>
-      </w:pPr>
-      <w:r>
-        <w:rPr>
-          <w:b/>
-          <w:bCs/>
-        </w:rPr>
-        <w:t>3.2 Syntaxe</w:t>
-      </w:r>
-    </w:p>
-    <w:p>
+          <w:lang w:val="en-GB"/>
+        </w:rPr>
+      </w:pPr>
+      <w:r>
+        <w:rPr>
+          <w:b/>
+          <w:bCs/>
+          <w:lang w:val="en-GB"/>
+        </w:rPr>
+        <w:t xml:space="preserve">3.2 </w:t>
+      </w:r>
+      <w:proofErr w:type="spellStart"/>
+      <w:r>
+        <w:rPr>
+          <w:b/>
+          <w:bCs/>
+          <w:lang w:val="en-GB"/>
+        </w:rPr>
+        <w:t>Syntaxe</w:t>
+      </w:r>
+      <w:proofErr w:type="spellEnd"/>
+    </w:p>
+    <w:p>
+      <w:pPr>
+        <w:rPr>
+          <w:lang w:val="en-GB"/>
+        </w:rPr>
+      </w:pPr>
       <w:proofErr w:type="spellStart"/>
       <w:proofErr w:type="gramStart"/>
       <w:r>
+        <w:rPr>
+          <w:lang w:val="en-GB"/>
+        </w:rPr>
         <w:t>canvas.draw</w:t>
       </w:r>
       <w:proofErr w:type="spellEnd"/>
       <w:proofErr w:type="gramEnd"/>
       <w:r>
+        <w:rPr>
+          <w:lang w:val="en-GB"/>
+        </w:rPr>
         <w:t>([</w:t>
       </w:r>
     </w:p>
     <w:p>
-      <w:r>
-        <w:t xml:space="preserve">    </w:t>
-      </w:r>
-      <w:proofErr w:type="spellStart"/>
-      <w:proofErr w:type="gramStart"/>
-      <w:r>
-        <w:t>circle</w:t>
-      </w:r>
-      <w:proofErr w:type="spellEnd"/>
-      <w:proofErr w:type="gramEnd"/>
-      <w:r>
-        <w:t xml:space="preserve"> 50 50 radius 20</w:t>
-      </w:r>
-    </w:p>
-    <w:p>
-      <w:pPr>
-        <w:rPr>
-          <w:lang w:val="en-GB"/>
-        </w:rPr>
-      </w:pPr>
-      <w:r>
+      <w:pPr>
+        <w:rPr>
+          <w:lang w:val="en-GB"/>
+        </w:rPr>
+      </w:pPr>
+      <w:r>
+        <w:rPr>
+          <w:lang w:val="en-GB"/>
+        </w:rPr>
+        <w:t xml:space="preserve">    circle 50 50 radius 20</w:t>
+      </w:r>
+    </w:p>
+    <w:p>
+      <w:pPr>
+        <w:rPr>
+          <w:lang w:val="en-GB"/>
+        </w:rPr>
+      </w:pPr>
+      <w:r>
+        <w:rPr>
+          <w:lang w:val="en-GB"/>
+        </w:rPr>
         <w:t xml:space="preserve">    </w:t>
       </w:r>
       <w:r>
@@ -1928,6 +1946,14 @@
       <w:tblPr>
         <w:tblW w:w="0" w:type="auto"/>
         <w:tblCellSpacing w:w="15" w:type="dxa"/>
+        <w:tblBorders>
+          <w:top w:val="single" w:sz="4" w:space="0" w:color="auto"/>
+          <w:left w:val="single" w:sz="4" w:space="0" w:color="auto"/>
+          <w:bottom w:val="single" w:sz="4" w:space="0" w:color="auto"/>
+          <w:right w:val="single" w:sz="4" w:space="0" w:color="auto"/>
+          <w:insideH w:val="single" w:sz="4" w:space="0" w:color="auto"/>
+          <w:insideV w:val="single" w:sz="4" w:space="0" w:color="auto"/>
+        </w:tblBorders>
         <w:tblCellMar>
           <w:top w:w="15" w:type="dxa"/>
           <w:left w:w="15" w:type="dxa"/>
@@ -1937,11 +1963,11 @@
         <w:tblLook w:val="04A0" w:firstRow="1" w:lastRow="0" w:firstColumn="1" w:lastColumn="0" w:noHBand="0" w:noVBand="1"/>
       </w:tblPr>
       <w:tblGrid>
-        <w:gridCol w:w="1783"/>
-        <w:gridCol w:w="1223"/>
-        <w:gridCol w:w="2266"/>
-        <w:gridCol w:w="1767"/>
-        <w:gridCol w:w="1702"/>
+        <w:gridCol w:w="1803"/>
+        <w:gridCol w:w="1243"/>
+        <w:gridCol w:w="2286"/>
+        <w:gridCol w:w="1787"/>
+        <w:gridCol w:w="1722"/>
       </w:tblGrid>
       <w:tr>
         <w:trPr>
@@ -2367,6 +2393,7 @@
           <w:b/>
           <w:bCs/>
         </w:rPr>
+        <w:lastRenderedPageBreak/>
         <w:t>7. Résumé</w:t>
       </w:r>
     </w:p>
@@ -2379,7 +2406,6 @@
       </w:pPr>
       <w:proofErr w:type="gramStart"/>
       <w:r>
-        <w:lastRenderedPageBreak/>
         <w:t>{ ...</w:t>
       </w:r>
       <w:proofErr w:type="gramEnd"/>
@@ -2492,7 +2518,7 @@
     <w:p>
       <w:r>
         <w:pict w14:anchorId="0591D992">
-          <v:rect id="_x0000_i1033" style="width:0;height:1.5pt" o:hralign="center" o:hrstd="t" o:hr="t" fillcolor="#a0a0a0" stroked="f"/>
+          <v:rect id="_x0000_i1032" style="width:0;height:1.5pt" o:hralign="center" o:hrstd="t" o:hr="t" fillcolor="#a0a0a0" stroked="f"/>
         </w:pict>
       </w:r>
     </w:p>
@@ -2694,15 +2720,14 @@
           <w:bottom w:val="single" w:sz="4" w:space="1" w:color="auto"/>
           <w:right w:val="single" w:sz="4" w:space="4" w:color="auto"/>
         </w:pBdr>
-        <w:rPr>
-          <w:lang w:val="en-GB"/>
-        </w:rPr>
-      </w:pPr>
-      <w:r>
-        <w:rPr>
-          <w:lang w:val="en-GB"/>
-        </w:rPr>
-        <w:t>let value = {</w:t>
+      </w:pPr>
+      <w:proofErr w:type="gramStart"/>
+      <w:r>
+        <w:t>let</w:t>
+      </w:r>
+      <w:proofErr w:type="gramEnd"/>
+      <w:r>
+        <w:t xml:space="preserve"> value = {</w:t>
       </w:r>
     </w:p>
     <w:p>
@@ -2713,15 +2738,25 @@
           <w:bottom w:val="single" w:sz="4" w:space="1" w:color="auto"/>
           <w:right w:val="single" w:sz="4" w:space="4" w:color="auto"/>
         </w:pBdr>
-        <w:rPr>
-          <w:lang w:val="en-GB"/>
-        </w:rPr>
-      </w:pPr>
-      <w:r>
-        <w:rPr>
-          <w:lang w:val="en-GB"/>
-        </w:rPr>
-        <w:t xml:space="preserve">    let base = int 3</w:t>
+      </w:pPr>
+      <w:r>
+        <w:t xml:space="preserve">    </w:t>
+      </w:r>
+      <w:proofErr w:type="gramStart"/>
+      <w:r>
+        <w:t>let</w:t>
+      </w:r>
+      <w:proofErr w:type="gramEnd"/>
+      <w:r>
+        <w:t xml:space="preserve"> base = </w:t>
+      </w:r>
+      <w:proofErr w:type="spellStart"/>
+      <w:r>
+        <w:t>int</w:t>
+      </w:r>
+      <w:proofErr w:type="spellEnd"/>
+      <w:r>
+        <w:t xml:space="preserve"> 3</w:t>
       </w:r>
     </w:p>
     <w:p>
@@ -2734,9 +2769,6 @@
         </w:pBdr>
       </w:pPr>
       <w:r>
-        <w:rPr>
-          <w:lang w:val="en-GB"/>
-        </w:rPr>
         <w:t xml:space="preserve">    </w:t>
       </w:r>
       <w:r>
@@ -2803,6 +2835,7 @@
         </w:pBdr>
       </w:pPr>
       <w:r>
+        <w:lastRenderedPageBreak/>
         <w:t xml:space="preserve">    }</w:t>
       </w:r>
     </w:p>
@@ -2816,7 +2849,6 @@
         </w:pBdr>
       </w:pPr>
       <w:r>
-        <w:lastRenderedPageBreak/>
         <w:t>}</w:t>
       </w:r>
     </w:p>
@@ -2843,18 +2875,22 @@
           <w:bottom w:val="single" w:sz="4" w:space="1" w:color="auto"/>
           <w:right w:val="single" w:sz="4" w:space="4" w:color="auto"/>
         </w:pBdr>
-      </w:pPr>
-      <w:proofErr w:type="spellStart"/>
+        <w:rPr>
+          <w:lang w:val="en-GB"/>
+        </w:rPr>
+      </w:pPr>
       <w:proofErr w:type="gramStart"/>
       <w:r>
-        <w:t>print</w:t>
-      </w:r>
-      <w:proofErr w:type="spellEnd"/>
-      <w:r>
-        <w:t>(</w:t>
+        <w:rPr>
+          <w:lang w:val="en-GB"/>
+        </w:rPr>
+        <w:t>print(</w:t>
       </w:r>
       <w:proofErr w:type="gramEnd"/>
       <w:r>
+        <w:rPr>
+          <w:lang w:val="en-GB"/>
+        </w:rPr>
         <w:t>{</w:t>
       </w:r>
     </w:p>
@@ -2866,25 +2902,15 @@
           <w:bottom w:val="single" w:sz="4" w:space="1" w:color="auto"/>
           <w:right w:val="single" w:sz="4" w:space="4" w:color="auto"/>
         </w:pBdr>
-      </w:pPr>
-      <w:r>
-        <w:t xml:space="preserve">    </w:t>
-      </w:r>
-      <w:proofErr w:type="gramStart"/>
-      <w:r>
-        <w:t>let</w:t>
-      </w:r>
-      <w:proofErr w:type="gramEnd"/>
-      <w:r>
-        <w:t xml:space="preserve"> a = </w:t>
-      </w:r>
-      <w:proofErr w:type="spellStart"/>
-      <w:r>
-        <w:t>int</w:t>
-      </w:r>
-      <w:proofErr w:type="spellEnd"/>
-      <w:r>
-        <w:t xml:space="preserve"> 1</w:t>
+        <w:rPr>
+          <w:lang w:val="en-GB"/>
+        </w:rPr>
+      </w:pPr>
+      <w:r>
+        <w:rPr>
+          <w:lang w:val="en-GB"/>
+        </w:rPr>
+        <w:t xml:space="preserve">    let a = int 1</w:t>
       </w:r>
     </w:p>
     <w:p>
@@ -2895,25 +2921,15 @@
           <w:bottom w:val="single" w:sz="4" w:space="1" w:color="auto"/>
           <w:right w:val="single" w:sz="4" w:space="4" w:color="auto"/>
         </w:pBdr>
-      </w:pPr>
-      <w:r>
-        <w:t xml:space="preserve">    </w:t>
-      </w:r>
-      <w:proofErr w:type="gramStart"/>
-      <w:r>
-        <w:t>let</w:t>
-      </w:r>
-      <w:proofErr w:type="gramEnd"/>
-      <w:r>
-        <w:t xml:space="preserve"> b = </w:t>
-      </w:r>
-      <w:proofErr w:type="spellStart"/>
-      <w:r>
-        <w:t>int</w:t>
-      </w:r>
-      <w:proofErr w:type="spellEnd"/>
-      <w:r>
-        <w:t xml:space="preserve"> 2</w:t>
+        <w:rPr>
+          <w:lang w:val="en-GB"/>
+        </w:rPr>
+      </w:pPr>
+      <w:r>
+        <w:rPr>
+          <w:lang w:val="en-GB"/>
+        </w:rPr>
+        <w:t xml:space="preserve">    let b = int 2</w:t>
       </w:r>
     </w:p>
     <w:p>
@@ -2926,6 +2942,9 @@
         </w:pBdr>
       </w:pPr>
       <w:r>
+        <w:rPr>
+          <w:lang w:val="en-GB"/>
+        </w:rPr>
         <w:t xml:space="preserve">    </w:t>
       </w:r>
       <w:proofErr w:type="gramStart"/>
@@ -2953,7 +2972,7 @@
     <w:p>
       <w:r>
         <w:pict w14:anchorId="4754585B">
-          <v:rect id="_x0000_i1034" style="width:0;height:1.5pt" o:hralign="center" o:hrstd="t" o:hr="t" fillcolor="#a0a0a0" stroked="f"/>
+          <v:rect id="_x0000_i1033" style="width:0;height:1.5pt" o:hralign="center" o:hrstd="t" o:hr="t" fillcolor="#a0a0a0" stroked="f"/>
         </w:pict>
       </w:r>
     </w:p>
@@ -3302,7 +3321,7 @@
     <w:p>
       <w:r>
         <w:pict w14:anchorId="09CE7C3F">
-          <v:rect id="_x0000_i1035" style="width:0;height:1.5pt" o:hralign="center" o:hrstd="t" o:hr="t" fillcolor="#a0a0a0" stroked="f"/>
+          <v:rect id="_x0000_i1034" style="width:0;height:1.5pt" o:hralign="center" o:hrstd="t" o:hr="t" fillcolor="#a0a0a0" stroked="f"/>
         </w:pict>
       </w:r>
     </w:p>
@@ -3318,6 +3337,7 @@
           <w:b/>
           <w:bCs/>
         </w:rPr>
+        <w:lastRenderedPageBreak/>
         <w:t xml:space="preserve">8.3 Bloc objet </w:t>
       </w:r>
       <w:proofErr w:type="spellStart"/>
@@ -3355,7 +3375,6 @@
     </w:p>
     <w:p>
       <w:r>
-        <w:lastRenderedPageBreak/>
         <w:t>Les objets regroupent des champs, des sous-objets et des méthodes.</w:t>
       </w:r>
     </w:p>
@@ -3382,15 +3401,27 @@
           <w:bottom w:val="single" w:sz="4" w:space="1" w:color="auto"/>
           <w:right w:val="single" w:sz="4" w:space="4" w:color="auto"/>
         </w:pBdr>
-        <w:rPr>
-          <w:lang w:val="en-GB"/>
-        </w:rPr>
-      </w:pPr>
-      <w:r>
-        <w:rPr>
-          <w:lang w:val="en-GB"/>
-        </w:rPr>
-        <w:t>person: object {</w:t>
+      </w:pPr>
+      <w:proofErr w:type="spellStart"/>
+      <w:proofErr w:type="gramStart"/>
+      <w:r>
+        <w:t>person</w:t>
+      </w:r>
+      <w:proofErr w:type="spellEnd"/>
+      <w:r>
+        <w:t>:</w:t>
+      </w:r>
+      <w:proofErr w:type="gramEnd"/>
+      <w:r>
+        <w:t xml:space="preserve"> </w:t>
+      </w:r>
+      <w:proofErr w:type="spellStart"/>
+      <w:r>
+        <w:t>object</w:t>
+      </w:r>
+      <w:proofErr w:type="spellEnd"/>
+      <w:r>
+        <w:t xml:space="preserve"> {</w:t>
       </w:r>
     </w:p>
     <w:p>
@@ -3406,10 +3437,13 @@
         </w:rPr>
       </w:pPr>
       <w:r>
-        <w:rPr>
-          <w:lang w:val="en-GB"/>
-        </w:rPr>
-        <w:t xml:space="preserve">    name: string "Alice"</w:t>
+        <w:t xml:space="preserve">    </w:t>
+      </w:r>
+      <w:r>
+        <w:rPr>
+          <w:lang w:val="en-GB"/>
+        </w:rPr>
+        <w:t>name: string "Alice"</w:t>
       </w:r>
     </w:p>
     <w:p>
@@ -3420,6 +3454,9 @@
           <w:bottom w:val="single" w:sz="4" w:space="1" w:color="auto"/>
           <w:right w:val="single" w:sz="4" w:space="4" w:color="auto"/>
         </w:pBdr>
+        <w:rPr>
+          <w:lang w:val="en-GB"/>
+        </w:rPr>
       </w:pPr>
       <w:r>
         <w:rPr>
@@ -3427,26 +3464,11 @@
         </w:rPr>
         <w:t xml:space="preserve">    </w:t>
       </w:r>
-      <w:proofErr w:type="spellStart"/>
-      <w:proofErr w:type="gramStart"/>
-      <w:r>
-        <w:t>age</w:t>
-      </w:r>
-      <w:proofErr w:type="spellEnd"/>
-      <w:r>
-        <w:t>:</w:t>
-      </w:r>
-      <w:proofErr w:type="gramEnd"/>
-      <w:r>
-        <w:t xml:space="preserve"> </w:t>
-      </w:r>
-      <w:proofErr w:type="spellStart"/>
-      <w:r>
-        <w:t>int</w:t>
-      </w:r>
-      <w:proofErr w:type="spellEnd"/>
-      <w:r>
-        <w:t xml:space="preserve"> 30</w:t>
+      <w:r>
+        <w:rPr>
+          <w:lang w:val="en-GB"/>
+        </w:rPr>
+        <w:t>age: int 30</w:t>
       </w:r>
     </w:p>
     <w:p>
@@ -3457,8 +3479,14 @@
           <w:bottom w:val="single" w:sz="4" w:space="1" w:color="auto"/>
           <w:right w:val="single" w:sz="4" w:space="4" w:color="auto"/>
         </w:pBdr>
-      </w:pPr>
-      <w:r>
+        <w:rPr>
+          <w:lang w:val="en-GB"/>
+        </w:rPr>
+      </w:pPr>
+      <w:r>
+        <w:rPr>
+          <w:lang w:val="en-GB"/>
+        </w:rPr>
         <w:t>}</w:t>
       </w:r>
     </w:p>
@@ -3485,15 +3513,27 @@
           <w:bottom w:val="single" w:sz="4" w:space="1" w:color="auto"/>
           <w:right w:val="single" w:sz="4" w:space="4" w:color="auto"/>
         </w:pBdr>
-        <w:rPr>
-          <w:lang w:val="en-GB"/>
-        </w:rPr>
-      </w:pPr>
-      <w:r>
-        <w:rPr>
-          <w:lang w:val="en-GB"/>
-        </w:rPr>
-        <w:t>person: object {</w:t>
+      </w:pPr>
+      <w:proofErr w:type="spellStart"/>
+      <w:proofErr w:type="gramStart"/>
+      <w:r>
+        <w:t>person</w:t>
+      </w:r>
+      <w:proofErr w:type="spellEnd"/>
+      <w:r>
+        <w:t>:</w:t>
+      </w:r>
+      <w:proofErr w:type="gramEnd"/>
+      <w:r>
+        <w:t xml:space="preserve"> </w:t>
+      </w:r>
+      <w:proofErr w:type="spellStart"/>
+      <w:r>
+        <w:t>object</w:t>
+      </w:r>
+      <w:proofErr w:type="spellEnd"/>
+      <w:r>
+        <w:t xml:space="preserve"> {</w:t>
       </w:r>
     </w:p>
     <w:p>
@@ -3509,9 +3549,6 @@
         </w:rPr>
       </w:pPr>
       <w:r>
-        <w:rPr>
-          <w:lang w:val="en-GB"/>
-        </w:rPr>
         <w:t xml:space="preserve">    </w:t>
       </w:r>
       <w:r>
@@ -3848,7 +3885,7 @@
     <w:p>
       <w:r>
         <w:pict w14:anchorId="5181208D">
-          <v:rect id="_x0000_i1036" style="width:0;height:1.5pt" o:hralign="center" o:hrstd="t" o:hr="t" fillcolor="#a0a0a0" stroked="f"/>
+          <v:rect id="_x0000_i1035" style="width:0;height:1.5pt" o:hralign="center" o:hrstd="t" o:hr="t" fillcolor="#a0a0a0" stroked="f"/>
         </w:pict>
       </w:r>
     </w:p>
@@ -3904,6 +3941,7 @@
           <w:b/>
           <w:bCs/>
         </w:rPr>
+        <w:lastRenderedPageBreak/>
         <w:t>Exemple 1 — Initialisation interne</w:t>
       </w:r>
     </w:p>
@@ -3915,23 +3953,15 @@
           <w:bottom w:val="single" w:sz="4" w:space="1" w:color="auto"/>
           <w:right w:val="single" w:sz="4" w:space="4" w:color="auto"/>
         </w:pBdr>
-      </w:pPr>
-      <w:proofErr w:type="gramStart"/>
-      <w:r>
-        <w:lastRenderedPageBreak/>
-        <w:t>config:</w:t>
-      </w:r>
-      <w:proofErr w:type="gramEnd"/>
-      <w:r>
-        <w:t xml:space="preserve"> </w:t>
-      </w:r>
-      <w:proofErr w:type="spellStart"/>
-      <w:r>
-        <w:t>object</w:t>
-      </w:r>
-      <w:proofErr w:type="spellEnd"/>
-      <w:r>
-        <w:t xml:space="preserve"> {</w:t>
+        <w:rPr>
+          <w:lang w:val="en-GB"/>
+        </w:rPr>
+      </w:pPr>
+      <w:r>
+        <w:rPr>
+          <w:lang w:val="en-GB"/>
+        </w:rPr>
+        <w:t>config: object {</w:t>
       </w:r>
     </w:p>
     <w:p>
@@ -3942,17 +3972,29 @@
           <w:bottom w:val="single" w:sz="4" w:space="1" w:color="auto"/>
           <w:right w:val="single" w:sz="4" w:space="4" w:color="auto"/>
         </w:pBdr>
-      </w:pPr>
-      <w:r>
+        <w:rPr>
+          <w:lang w:val="en-GB"/>
+        </w:rPr>
+      </w:pPr>
+      <w:r>
+        <w:rPr>
+          <w:lang w:val="en-GB"/>
+        </w:rPr>
         <w:t xml:space="preserve">    </w:t>
       </w:r>
-      <w:proofErr w:type="gramStart"/>
-      <w:r>
-        <w:t>init:</w:t>
-      </w:r>
-      <w:proofErr w:type="gramEnd"/>
-      <w:r>
-        <w:t xml:space="preserve"> block {</w:t>
+      <w:proofErr w:type="spellStart"/>
+      <w:r>
+        <w:rPr>
+          <w:lang w:val="en-GB"/>
+        </w:rPr>
+        <w:t>init</w:t>
+      </w:r>
+      <w:proofErr w:type="spellEnd"/>
+      <w:r>
+        <w:rPr>
+          <w:lang w:val="en-GB"/>
+        </w:rPr>
+        <w:t>: block {</w:t>
       </w:r>
     </w:p>
     <w:p>
@@ -3963,25 +4005,15 @@
           <w:bottom w:val="single" w:sz="4" w:space="1" w:color="auto"/>
           <w:right w:val="single" w:sz="4" w:space="4" w:color="auto"/>
         </w:pBdr>
-      </w:pPr>
-      <w:r>
-        <w:t xml:space="preserve">        </w:t>
-      </w:r>
-      <w:proofErr w:type="gramStart"/>
-      <w:r>
-        <w:t>let</w:t>
-      </w:r>
-      <w:proofErr w:type="gramEnd"/>
-      <w:r>
-        <w:t xml:space="preserve"> x = </w:t>
-      </w:r>
-      <w:proofErr w:type="spellStart"/>
-      <w:r>
-        <w:t>int</w:t>
-      </w:r>
-      <w:proofErr w:type="spellEnd"/>
-      <w:r>
-        <w:t xml:space="preserve"> 10</w:t>
+        <w:rPr>
+          <w:lang w:val="en-GB"/>
+        </w:rPr>
+      </w:pPr>
+      <w:r>
+        <w:rPr>
+          <w:lang w:val="en-GB"/>
+        </w:rPr>
+        <w:t xml:space="preserve">        let x = int 10</w:t>
       </w:r>
     </w:p>
     <w:p>
@@ -3994,6 +4026,9 @@
         </w:pBdr>
       </w:pPr>
       <w:r>
+        <w:rPr>
+          <w:lang w:val="en-GB"/>
+        </w:rPr>
         <w:t xml:space="preserve">        </w:t>
       </w:r>
       <w:proofErr w:type="gramStart"/>
@@ -4054,23 +4089,27 @@
           <w:bottom w:val="single" w:sz="4" w:space="1" w:color="auto"/>
           <w:right w:val="single" w:sz="4" w:space="4" w:color="auto"/>
         </w:pBdr>
-        <w:rPr>
-          <w:lang w:val="en-GB"/>
-        </w:rPr>
       </w:pPr>
       <w:proofErr w:type="spellStart"/>
-      <w:r>
-        <w:rPr>
-          <w:lang w:val="en-GB"/>
-        </w:rPr>
+      <w:proofErr w:type="gramStart"/>
+      <w:r>
         <w:t>npc</w:t>
       </w:r>
       <w:proofErr w:type="spellEnd"/>
       <w:r>
-        <w:rPr>
-          <w:lang w:val="en-GB"/>
-        </w:rPr>
-        <w:t>: object {</w:t>
+        <w:t>:</w:t>
+      </w:r>
+      <w:proofErr w:type="gramEnd"/>
+      <w:r>
+        <w:t xml:space="preserve"> </w:t>
+      </w:r>
+      <w:proofErr w:type="spellStart"/>
+      <w:r>
+        <w:t>object</w:t>
+      </w:r>
+      <w:proofErr w:type="spellEnd"/>
+      <w:r>
+        <w:t xml:space="preserve"> {</w:t>
       </w:r>
     </w:p>
     <w:p>
@@ -4086,9 +4125,6 @@
         </w:rPr>
       </w:pPr>
       <w:r>
-        <w:rPr>
-          <w:lang w:val="en-GB"/>
-        </w:rPr>
         <w:t xml:space="preserve">    </w:t>
       </w:r>
       <w:r>
@@ -4264,15 +4300,22 @@
           <w:bottom w:val="single" w:sz="4" w:space="1" w:color="auto"/>
           <w:right w:val="single" w:sz="4" w:space="4" w:color="auto"/>
         </w:pBdr>
-        <w:rPr>
-          <w:lang w:val="en-GB"/>
-        </w:rPr>
-      </w:pPr>
-      <w:r>
-        <w:rPr>
-          <w:lang w:val="en-GB"/>
-        </w:rPr>
-        <w:t>processor: object {</w:t>
+      </w:pPr>
+      <w:proofErr w:type="gramStart"/>
+      <w:r>
+        <w:t>processor:</w:t>
+      </w:r>
+      <w:proofErr w:type="gramEnd"/>
+      <w:r>
+        <w:t xml:space="preserve"> </w:t>
+      </w:r>
+      <w:proofErr w:type="spellStart"/>
+      <w:r>
+        <w:t>object</w:t>
+      </w:r>
+      <w:proofErr w:type="spellEnd"/>
+      <w:r>
+        <w:t xml:space="preserve"> {</w:t>
       </w:r>
     </w:p>
     <w:p>
@@ -4288,9 +4331,6 @@
         </w:rPr>
       </w:pPr>
       <w:r>
-        <w:rPr>
-          <w:lang w:val="en-GB"/>
-        </w:rPr>
         <w:t xml:space="preserve">    </w:t>
       </w:r>
       <w:r>
@@ -4525,6 +4565,7 @@
         <w:rPr>
           <w:lang w:val="en-GB"/>
         </w:rPr>
+        <w:lastRenderedPageBreak/>
         <w:t xml:space="preserve">        if timeout &lt; 0 {</w:t>
       </w:r>
     </w:p>
@@ -4544,7 +4585,6 @@
         <w:rPr>
           <w:lang w:val="en-GB"/>
         </w:rPr>
-        <w:lastRenderedPageBreak/>
         <w:t xml:space="preserve">            </w:t>
       </w:r>
       <w:proofErr w:type="gramStart"/>
@@ -4622,7 +4662,7 @@
     <w:p>
       <w:r>
         <w:pict w14:anchorId="61CAACBE">
-          <v:rect id="_x0000_i1037" style="width:0;height:1.5pt" o:hralign="center" o:hrstd="t" o:hr="t" fillcolor="#a0a0a0" stroked="f"/>
+          <v:rect id="_x0000_i1036" style="width:0;height:1.5pt" o:hralign="center" o:hrstd="t" o:hr="t" fillcolor="#a0a0a0" stroked="f"/>
         </w:pict>
       </w:r>
     </w:p>
@@ -4935,14 +4975,14 @@
         </w:pBdr>
       </w:pPr>
       <w:r>
+        <w:lastRenderedPageBreak/>
         <w:t>}</w:t>
       </w:r>
     </w:p>
     <w:p>
       <w:r>
-        <w:lastRenderedPageBreak/>
         <w:pict w14:anchorId="30384A4D">
-          <v:rect id="_x0000_i1039" style="width:0;height:1.5pt" o:hralign="center" o:hrstd="t" o:hr="t" fillcolor="#a0a0a0" stroked="f"/>
+          <v:rect id="_x0000_i1037" style="width:0;height:1.5pt" o:hralign="center" o:hrstd="t" o:hr="t" fillcolor="#a0a0a0" stroked="f"/>
         </w:pict>
       </w:r>
     </w:p>
@@ -4978,7 +5018,7 @@
     <w:p>
       <w:r>
         <w:pict w14:anchorId="7A87461C">
-          <v:rect id="_x0000_i1040" style="width:0;height:1.5pt" o:hralign="center" o:hrstd="t" o:hr="t" fillcolor="#a0a0a0" stroked="f"/>
+          <v:rect id="_x0000_i1038" style="width:0;height:1.5pt" o:hralign="center" o:hrstd="t" o:hr="t" fillcolor="#a0a0a0" stroked="f"/>
         </w:pict>
       </w:r>
     </w:p>
@@ -5580,6 +5620,7 @@
         <w:rPr>
           <w:lang w:val="en-GB"/>
         </w:rPr>
+        <w:lastRenderedPageBreak/>
         <w:t xml:space="preserve">                 | path</w:t>
       </w:r>
     </w:p>
@@ -5599,7 +5640,6 @@
         <w:rPr>
           <w:lang w:val="en-GB"/>
         </w:rPr>
-        <w:lastRenderedPageBreak/>
         <w:t xml:space="preserve">                 | function-call</w:t>
       </w:r>
     </w:p>
@@ -5666,7 +5706,7 @@
     <w:p>
       <w:r>
         <w:pict w14:anchorId="32998DB8">
-          <v:rect id="_x0000_i1041" style="width:0;height:1.5pt" o:hralign="center" o:hrstd="t" o:hr="t" fillcolor="#a0a0a0" stroked="f"/>
+          <v:rect id="_x0000_i1039" style="width:0;height:1.5pt" o:hralign="center" o:hrstd="t" o:hr="t" fillcolor="#a0a0a0" stroked="f"/>
         </w:pict>
       </w:r>
     </w:p>
@@ -6039,7 +6079,7 @@
     <w:p>
       <w:r>
         <w:pict w14:anchorId="47DE94E6">
-          <v:rect id="_x0000_i1042" style="width:0;height:1.5pt" o:hralign="center" o:hrstd="t" o:hr="t" fillcolor="#a0a0a0" stroked="f"/>
+          <v:rect id="_x0000_i1040" style="width:0;height:1.5pt" o:hralign="center" o:hrstd="t" o:hr="t" fillcolor="#a0a0a0" stroked="f"/>
         </w:pict>
       </w:r>
     </w:p>
@@ -6145,6 +6185,7 @@
         <w:rPr>
           <w:lang w:val="en-GB"/>
         </w:rPr>
+        <w:lastRenderedPageBreak/>
         <w:t>object-block = "object</w:t>
       </w:r>
       <w:proofErr w:type="gramStart"/>
@@ -6587,7 +6628,7 @@
     <w:p>
       <w:r>
         <w:pict w14:anchorId="41031937">
-          <v:rect id="_x0000_i1043" style="width:0;height:1.5pt" o:hralign="center" o:hrstd="t" o:hr="t" fillcolor="#a0a0a0" stroked="f"/>
+          <v:rect id="_x0000_i1041" style="width:0;height:1.5pt" o:hralign="center" o:hrstd="t" o:hr="t" fillcolor="#a0a0a0" stroked="f"/>
         </w:pict>
       </w:r>
     </w:p>
@@ -6699,7 +6740,7 @@
     <w:p>
       <w:r>
         <w:pict w14:anchorId="2EEB2EC5">
-          <v:rect id="_x0000_i1044" style="width:0;height:1.5pt" o:hralign="center" o:hrstd="t" o:hr="t" fillcolor="#a0a0a0" stroked="f"/>
+          <v:rect id="_x0000_i1042" style="width:0;height:1.5pt" o:hralign="center" o:hrstd="t" o:hr="t" fillcolor="#a0a0a0" stroked="f"/>
         </w:pict>
       </w:r>
     </w:p>
@@ -6859,6 +6900,7 @@
           <w:b/>
           <w:bCs/>
         </w:rPr>
+        <w:lastRenderedPageBreak/>
         <w:t>Littéraux</w:t>
       </w:r>
     </w:p>
@@ -6874,7 +6916,6 @@
       <w:proofErr w:type="spellStart"/>
       <w:proofErr w:type="gramStart"/>
       <w:r>
-        <w:lastRenderedPageBreak/>
         <w:t>literal</w:t>
       </w:r>
       <w:proofErr w:type="spellEnd"/>
@@ -7261,7 +7302,7 @@
     <w:p>
       <w:r>
         <w:pict w14:anchorId="0F6E029A">
-          <v:rect id="_x0000_i1045" style="width:0;height:1.5pt" o:hralign="center" o:hrstd="t" o:hr="t" fillcolor="#a0a0a0" stroked="f"/>
+          <v:rect id="_x0000_i1043" style="width:0;height:1.5pt" o:hralign="center" o:hrstd="t" o:hr="t" fillcolor="#a0a0a0" stroked="f"/>
         </w:pict>
       </w:r>
     </w:p>
@@ -7413,8 +7454,9 @@
     </w:p>
     <w:p>
       <w:r>
+        <w:lastRenderedPageBreak/>
         <w:pict w14:anchorId="0A6688EB">
-          <v:rect id="_x0000_i1046" style="width:0;height:1.5pt" o:hralign="center" o:hrstd="t" o:hr="t" fillcolor="#a0a0a0" stroked="f"/>
+          <v:rect id="_x0000_i1044" style="width:0;height:1.5pt" o:hralign="center" o:hrstd="t" o:hr="t" fillcolor="#a0a0a0" stroked="f"/>
         </w:pict>
       </w:r>
     </w:p>
@@ -7430,7 +7472,6 @@
           <w:b/>
           <w:bCs/>
         </w:rPr>
-        <w:lastRenderedPageBreak/>
         <w:t>10. Sémantique d’évaluation des blocs</w:t>
       </w:r>
     </w:p>
@@ -7442,7 +7483,7 @@
     <w:p>
       <w:r>
         <w:pict w14:anchorId="2188EE01">
-          <v:rect id="_x0000_i1048" style="width:0;height:1.5pt" o:hralign="center" o:hrstd="t" o:hr="t" fillcolor="#a0a0a0" stroked="f"/>
+          <v:rect id="_x0000_i1045" style="width:0;height:1.5pt" o:hralign="center" o:hrstd="t" o:hr="t" fillcolor="#a0a0a0" stroked="f"/>
         </w:pict>
       </w:r>
     </w:p>
@@ -7572,7 +7613,7 @@
     <w:p>
       <w:r>
         <w:pict w14:anchorId="1D1F5683">
-          <v:rect id="_x0000_i1049" style="width:0;height:1.5pt" o:hralign="center" o:hrstd="t" o:hr="t" fillcolor="#a0a0a0" stroked="f"/>
+          <v:rect id="_x0000_i1046" style="width:0;height:1.5pt" o:hralign="center" o:hrstd="t" o:hr="t" fillcolor="#a0a0a0" stroked="f"/>
         </w:pict>
       </w:r>
     </w:p>
@@ -7780,12 +7821,12 @@
         </w:pBdr>
       </w:pPr>
       <w:r>
+        <w:lastRenderedPageBreak/>
         <w:t>}</w:t>
       </w:r>
     </w:p>
     <w:p>
       <w:r>
-        <w:lastRenderedPageBreak/>
         <w:t>Évaluation :</w:t>
       </w:r>
     </w:p>
@@ -7859,7 +7900,7 @@
     <w:p>
       <w:r>
         <w:pict w14:anchorId="56469144">
-          <v:rect id="_x0000_i1050" style="width:0;height:1.5pt" o:hralign="center" o:hrstd="t" o:hr="t" fillcolor="#a0a0a0" stroked="f"/>
+          <v:rect id="_x0000_i1047" style="width:0;height:1.5pt" o:hralign="center" o:hrstd="t" o:hr="t" fillcolor="#a0a0a0" stroked="f"/>
         </w:pict>
       </w:r>
     </w:p>
@@ -8086,7 +8127,7 @@
     <w:p>
       <w:r>
         <w:pict w14:anchorId="6C3FC7F3">
-          <v:rect id="_x0000_i1051" style="width:0;height:1.5pt" o:hralign="center" o:hrstd="t" o:hr="t" fillcolor="#a0a0a0" stroked="f"/>
+          <v:rect id="_x0000_i1048" style="width:0;height:1.5pt" o:hralign="center" o:hrstd="t" o:hr="t" fillcolor="#a0a0a0" stroked="f"/>
         </w:pict>
       </w:r>
     </w:p>
@@ -8133,12 +8174,12 @@
           <w:b/>
           <w:bCs/>
         </w:rPr>
+        <w:lastRenderedPageBreak/>
         <w:t>10.4.1 Déroulement</w:t>
       </w:r>
     </w:p>
     <w:p>
       <w:r>
-        <w:lastRenderedPageBreak/>
         <w:t xml:space="preserve">Un objet est évalué comme une </w:t>
       </w:r>
       <w:r>
@@ -8406,7 +8447,7 @@
     <w:p>
       <w:r>
         <w:pict w14:anchorId="65E6A4D8">
-          <v:rect id="_x0000_i1052" style="width:0;height:1.5pt" o:hralign="center" o:hrstd="t" o:hr="t" fillcolor="#a0a0a0" stroked="f"/>
+          <v:rect id="_x0000_i1049" style="width:0;height:1.5pt" o:hralign="center" o:hrstd="t" o:hr="t" fillcolor="#a0a0a0" stroked="f"/>
         </w:pict>
       </w:r>
     </w:p>
@@ -8540,6 +8581,7 @@
         </w:pBdr>
       </w:pPr>
       <w:r>
+        <w:lastRenderedPageBreak/>
         <w:t xml:space="preserve">config: </w:t>
       </w:r>
       <w:proofErr w:type="spellStart"/>
@@ -8561,7 +8603,6 @@
         </w:pBdr>
       </w:pPr>
       <w:r>
-        <w:lastRenderedPageBreak/>
         <w:t xml:space="preserve">    init: block {</w:t>
       </w:r>
     </w:p>
@@ -8733,7 +8774,7 @@
     <w:p>
       <w:r>
         <w:pict w14:anchorId="5C4EDE24">
-          <v:rect id="_x0000_i1053" style="width:0;height:1.5pt" o:hralign="center" o:hrstd="t" o:hr="t" fillcolor="#a0a0a0" stroked="f"/>
+          <v:rect id="_x0000_i1050" style="width:0;height:1.5pt" o:hralign="center" o:hrstd="t" o:hr="t" fillcolor="#a0a0a0" stroked="f"/>
         </w:pict>
       </w:r>
     </w:p>
@@ -8855,7 +8896,7 @@
     <w:p>
       <w:r>
         <w:pict w14:anchorId="58ACE597">
-          <v:rect id="_x0000_i1054" style="width:0;height:1.5pt" o:hralign="center" o:hrstd="t" o:hr="t" fillcolor="#a0a0a0" stroked="f"/>
+          <v:rect id="_x0000_i1051" style="width:0;height:1.5pt" o:hralign="center" o:hrstd="t" o:hr="t" fillcolor="#a0a0a0" stroked="f"/>
         </w:pict>
       </w:r>
     </w:p>
@@ -8898,6 +8939,7 @@
         </w:numPr>
       </w:pPr>
       <w:r>
+        <w:lastRenderedPageBreak/>
         <w:t>Une erreur dans un bloc dialecte empêche sa construction.</w:t>
       </w:r>
     </w:p>
@@ -8909,7 +8951,6 @@
         </w:numPr>
       </w:pPr>
       <w:r>
-        <w:lastRenderedPageBreak/>
         <w:t>Une erreur dans un objet empêche sa création.</w:t>
       </w:r>
     </w:p>
@@ -8940,7 +8981,7 @@
     <w:p>
       <w:r>
         <w:pict w14:anchorId="7BF0BBE0">
-          <v:rect id="_x0000_i1055" style="width:0;height:1.5pt" o:hralign="center" o:hrstd="t" o:hr="t" fillcolor="#a0a0a0" stroked="f"/>
+          <v:rect id="_x0000_i1052" style="width:0;height:1.5pt" o:hralign="center" o:hrstd="t" o:hr="t" fillcolor="#a0a0a0" stroked="f"/>
         </w:pict>
       </w:r>
     </w:p>
@@ -8963,6 +9004,14 @@
       <w:tblPr>
         <w:tblW w:w="0" w:type="auto"/>
         <w:tblCellSpacing w:w="15" w:type="dxa"/>
+        <w:tblBorders>
+          <w:top w:val="single" w:sz="4" w:space="0" w:color="auto"/>
+          <w:left w:val="single" w:sz="4" w:space="0" w:color="auto"/>
+          <w:bottom w:val="single" w:sz="4" w:space="0" w:color="auto"/>
+          <w:right w:val="single" w:sz="4" w:space="0" w:color="auto"/>
+          <w:insideH w:val="single" w:sz="4" w:space="0" w:color="auto"/>
+          <w:insideV w:val="single" w:sz="4" w:space="0" w:color="auto"/>
+        </w:tblBorders>
         <w:tblCellMar>
           <w:top w:w="15" w:type="dxa"/>
           <w:left w:w="15" w:type="dxa"/>
@@ -8972,11 +9021,11 @@
         <w:tblLook w:val="04A0" w:firstRow="1" w:lastRow="0" w:firstColumn="1" w:lastColumn="0" w:noHBand="0" w:noVBand="1"/>
       </w:tblPr>
       <w:tblGrid>
-        <w:gridCol w:w="1245"/>
-        <w:gridCol w:w="2347"/>
-        <w:gridCol w:w="2289"/>
-        <w:gridCol w:w="1858"/>
-        <w:gridCol w:w="1333"/>
+        <w:gridCol w:w="1248"/>
+        <w:gridCol w:w="2338"/>
+        <w:gridCol w:w="2280"/>
+        <w:gridCol w:w="1854"/>
+        <w:gridCol w:w="1342"/>
       </w:tblGrid>
       <w:tr>
         <w:trPr>
@@ -9363,7 +9412,7 @@
     <w:p>
       <w:r>
         <w:pict w14:anchorId="5D648166">
-          <v:rect id="_x0000_i1056" style="width:0;height:1.5pt" o:hralign="center" o:hrstd="t" o:hr="t" fillcolor="#a0a0a0" stroked="f"/>
+          <v:rect id="_x0000_i1053" style="width:0;height:1.5pt" o:hralign="center" o:hrstd="t" o:hr="t" fillcolor="#a0a0a0" stroked="f"/>
         </w:pict>
       </w:r>
     </w:p>
@@ -9467,7 +9516,7 @@
     <w:p>
       <w:r>
         <w:pict w14:anchorId="19BB1A64">
-          <v:rect id="_x0000_i1058" style="width:0;height:1.5pt" o:hralign="center" o:hrstd="t" o:hr="t" fillcolor="#a0a0a0" stroked="f"/>
+          <v:rect id="_x0000_i1054" style="width:0;height:1.5pt" o:hralign="center" o:hrstd="t" o:hr="t" fillcolor="#a0a0a0" stroked="f"/>
         </w:pict>
       </w:r>
     </w:p>
@@ -9488,6 +9537,7 @@
     </w:p>
     <w:p>
       <w:r>
+        <w:lastRenderedPageBreak/>
         <w:t>Le parseur doit reconnaître les blocs selon un ordre strict, afin d’éviter toute ambiguïté syntaxique.</w:t>
       </w:r>
     </w:p>
@@ -9503,7 +9553,6 @@
           <w:b/>
           <w:bCs/>
         </w:rPr>
-        <w:lastRenderedPageBreak/>
         <w:t>Ordre de priorité :</w:t>
       </w:r>
     </w:p>
@@ -9644,7 +9693,7 @@
     <w:p>
       <w:r>
         <w:pict w14:anchorId="39F01DE9">
-          <v:rect id="_x0000_i1059" style="width:0;height:1.5pt" o:hralign="center" o:hrstd="t" o:hr="t" fillcolor="#a0a0a0" stroked="f"/>
+          <v:rect id="_x0000_i1055" style="width:0;height:1.5pt" o:hralign="center" o:hrstd="t" o:hr="t" fillcolor="#a0a0a0" stroked="f"/>
         </w:pict>
       </w:r>
     </w:p>
@@ -9791,7 +9840,7 @@
     <w:p>
       <w:r>
         <w:pict w14:anchorId="4BB8343B">
-          <v:rect id="_x0000_i1060" style="width:0;height:1.5pt" o:hralign="center" o:hrstd="t" o:hr="t" fillcolor="#a0a0a0" stroked="f"/>
+          <v:rect id="_x0000_i1056" style="width:0;height:1.5pt" o:hralign="center" o:hrstd="t" o:hr="t" fillcolor="#a0a0a0" stroked="f"/>
         </w:pict>
       </w:r>
     </w:p>
@@ -9862,6 +9911,7 @@
         </w:numPr>
       </w:pPr>
       <w:r>
+        <w:lastRenderedPageBreak/>
         <w:t>Le parseur doit lire ligne par ligne.</w:t>
       </w:r>
     </w:p>
@@ -9873,7 +9923,6 @@
         </w:numPr>
       </w:pPr>
       <w:r>
-        <w:lastRenderedPageBreak/>
         <w:t>Chaque ligne commence par une commande en kebab-case.</w:t>
       </w:r>
     </w:p>
@@ -9977,7 +10026,7 @@
     <w:p>
       <w:r>
         <w:pict w14:anchorId="74B8AB4C">
-          <v:rect id="_x0000_i1061" style="width:0;height:1.5pt" o:hralign="center" o:hrstd="t" o:hr="t" fillcolor="#a0a0a0" stroked="f"/>
+          <v:rect id="_x0000_i1057" style="width:0;height:1.5pt" o:hralign="center" o:hrstd="t" o:hr="t" fillcolor="#a0a0a0" stroked="f"/>
         </w:pict>
       </w:r>
     </w:p>
@@ -10186,7 +10235,7 @@
     <w:p>
       <w:r>
         <w:pict w14:anchorId="6B908A14">
-          <v:rect id="_x0000_i1062" style="width:0;height:1.5pt" o:hralign="center" o:hrstd="t" o:hr="t" fillcolor="#a0a0a0" stroked="f"/>
+          <v:rect id="_x0000_i1058" style="width:0;height:1.5pt" o:hralign="center" o:hrstd="t" o:hr="t" fillcolor="#a0a0a0" stroked="f"/>
         </w:pict>
       </w:r>
     </w:p>
@@ -10257,6 +10306,7 @@
         </w:numPr>
       </w:pPr>
       <w:r>
+        <w:lastRenderedPageBreak/>
         <w:t>Le parseur doit reconnaître block comme un mot-clé distinct.</w:t>
       </w:r>
     </w:p>
@@ -10268,7 +10318,6 @@
         </w:numPr>
       </w:pPr>
       <w:r>
-        <w:lastRenderedPageBreak/>
         <w:t>Le contenu interne est un bloc d’exécution standard.</w:t>
       </w:r>
     </w:p>
@@ -10345,7 +10394,7 @@
     <w:p>
       <w:r>
         <w:pict w14:anchorId="230E0AB1">
-          <v:rect id="_x0000_i1063" style="width:0;height:1.5pt" o:hralign="center" o:hrstd="t" o:hr="t" fillcolor="#a0a0a0" stroked="f"/>
+          <v:rect id="_x0000_i1059" style="width:0;height:1.5pt" o:hralign="center" o:hrstd="t" o:hr="t" fillcolor="#a0a0a0" stroked="f"/>
         </w:pict>
       </w:r>
     </w:p>
@@ -10513,7 +10562,7 @@
     <w:p>
       <w:r>
         <w:pict w14:anchorId="6CBCF1A7">
-          <v:rect id="_x0000_i1064" style="width:0;height:1.5pt" o:hralign="center" o:hrstd="t" o:hr="t" fillcolor="#a0a0a0" stroked="f"/>
+          <v:rect id="_x0000_i1060" style="width:0;height:1.5pt" o:hralign="center" o:hrstd="t" o:hr="t" fillcolor="#a0a0a0" stroked="f"/>
         </w:pict>
       </w:r>
     </w:p>
@@ -10634,6 +10683,7 @@
         </w:numPr>
       </w:pPr>
       <w:r>
+        <w:lastRenderedPageBreak/>
         <w:t>identifiants, types, chemins, littéraux</w:t>
       </w:r>
     </w:p>
@@ -10649,7 +10699,6 @@
           <w:b/>
           <w:bCs/>
         </w:rPr>
-        <w:lastRenderedPageBreak/>
         <w:t>Étape 2 — Analyse syntaxique</w:t>
       </w:r>
     </w:p>
@@ -10752,7 +10801,7 @@
     <w:p>
       <w:r>
         <w:pict w14:anchorId="278F8D34">
-          <v:rect id="_x0000_i1065" style="width:0;height:1.5pt" o:hralign="center" o:hrstd="t" o:hr="t" fillcolor="#a0a0a0" stroked="f"/>
+          <v:rect id="_x0000_i1061" style="width:0;height:1.5pt" o:hralign="center" o:hrstd="t" o:hr="t" fillcolor="#a0a0a0" stroked="f"/>
         </w:pict>
       </w:r>
     </w:p>
@@ -10773,8 +10822,16 @@
     </w:p>
     <w:tbl>
       <w:tblPr>
-        <w:tblW w:w="0" w:type="auto"/>
+        <w:tblW w:w="9067" w:type="dxa"/>
         <w:tblCellSpacing w:w="15" w:type="dxa"/>
+        <w:tblBorders>
+          <w:top w:val="single" w:sz="4" w:space="0" w:color="auto"/>
+          <w:left w:val="single" w:sz="4" w:space="0" w:color="auto"/>
+          <w:bottom w:val="single" w:sz="4" w:space="0" w:color="auto"/>
+          <w:right w:val="single" w:sz="4" w:space="0" w:color="auto"/>
+          <w:insideH w:val="single" w:sz="4" w:space="0" w:color="auto"/>
+          <w:insideV w:val="single" w:sz="4" w:space="0" w:color="auto"/>
+        </w:tblBorders>
         <w:tblCellMar>
           <w:top w:w="15" w:type="dxa"/>
           <w:left w:w="15" w:type="dxa"/>
@@ -10784,11 +10841,11 @@
         <w:tblLook w:val="04A0" w:firstRow="1" w:lastRow="0" w:firstColumn="1" w:lastColumn="0" w:noHBand="0" w:noVBand="1"/>
       </w:tblPr>
       <w:tblGrid>
-        <w:gridCol w:w="1223"/>
-        <w:gridCol w:w="1139"/>
-        <w:gridCol w:w="1542"/>
-        <w:gridCol w:w="1298"/>
-        <w:gridCol w:w="880"/>
+        <w:gridCol w:w="1555"/>
+        <w:gridCol w:w="1559"/>
+        <w:gridCol w:w="1984"/>
+        <w:gridCol w:w="1843"/>
+        <w:gridCol w:w="2126"/>
       </w:tblGrid>
       <w:tr>
         <w:trPr>
@@ -10797,7 +10854,7 @@
         </w:trPr>
         <w:tc>
           <w:tcPr>
-            <w:tcW w:w="0" w:type="auto"/>
+            <w:tcW w:w="1510" w:type="dxa"/>
             <w:vAlign w:val="center"/>
             <w:hideMark/>
           </w:tcPr>
@@ -10819,7 +10876,7 @@
         </w:tc>
         <w:tc>
           <w:tcPr>
-            <w:tcW w:w="0" w:type="auto"/>
+            <w:tcW w:w="1529" w:type="dxa"/>
             <w:vAlign w:val="center"/>
             <w:hideMark/>
           </w:tcPr>
@@ -10841,7 +10898,7 @@
         </w:tc>
         <w:tc>
           <w:tcPr>
-            <w:tcW w:w="0" w:type="auto"/>
+            <w:tcW w:w="1954" w:type="dxa"/>
             <w:vAlign w:val="center"/>
             <w:hideMark/>
           </w:tcPr>
@@ -10863,7 +10920,7 @@
         </w:tc>
         <w:tc>
           <w:tcPr>
-            <w:tcW w:w="0" w:type="auto"/>
+            <w:tcW w:w="1813" w:type="dxa"/>
             <w:vAlign w:val="center"/>
             <w:hideMark/>
           </w:tcPr>
@@ -10885,7 +10942,7 @@
         </w:tc>
         <w:tc>
           <w:tcPr>
-            <w:tcW w:w="0" w:type="auto"/>
+            <w:tcW w:w="2081" w:type="dxa"/>
             <w:vAlign w:val="center"/>
             <w:hideMark/>
           </w:tcPr>
@@ -10912,7 +10969,7 @@
         </w:trPr>
         <w:tc>
           <w:tcPr>
-            <w:tcW w:w="0" w:type="auto"/>
+            <w:tcW w:w="1510" w:type="dxa"/>
             <w:vAlign w:val="center"/>
             <w:hideMark/>
           </w:tcPr>
@@ -10924,7 +10981,7 @@
         </w:tc>
         <w:tc>
           <w:tcPr>
-            <w:tcW w:w="0" w:type="auto"/>
+            <w:tcW w:w="1529" w:type="dxa"/>
             <w:vAlign w:val="center"/>
             <w:hideMark/>
           </w:tcPr>
@@ -10936,7 +10993,7 @@
         </w:tc>
         <w:tc>
           <w:tcPr>
-            <w:tcW w:w="0" w:type="auto"/>
+            <w:tcW w:w="1954" w:type="dxa"/>
             <w:vAlign w:val="center"/>
             <w:hideMark/>
           </w:tcPr>
@@ -10948,7 +11005,7 @@
         </w:tc>
         <w:tc>
           <w:tcPr>
-            <w:tcW w:w="0" w:type="auto"/>
+            <w:tcW w:w="1813" w:type="dxa"/>
             <w:vAlign w:val="center"/>
             <w:hideMark/>
           </w:tcPr>
@@ -10960,7 +11017,7 @@
         </w:tc>
         <w:tc>
           <w:tcPr>
-            <w:tcW w:w="0" w:type="auto"/>
+            <w:tcW w:w="2081" w:type="dxa"/>
             <w:vAlign w:val="center"/>
             <w:hideMark/>
           </w:tcPr>
@@ -10977,7 +11034,7 @@
         </w:trPr>
         <w:tc>
           <w:tcPr>
-            <w:tcW w:w="0" w:type="auto"/>
+            <w:tcW w:w="1510" w:type="dxa"/>
             <w:vAlign w:val="center"/>
             <w:hideMark/>
           </w:tcPr>
@@ -10989,7 +11046,7 @@
         </w:tc>
         <w:tc>
           <w:tcPr>
-            <w:tcW w:w="0" w:type="auto"/>
+            <w:tcW w:w="1529" w:type="dxa"/>
             <w:vAlign w:val="center"/>
             <w:hideMark/>
           </w:tcPr>
@@ -11001,7 +11058,7 @@
         </w:tc>
         <w:tc>
           <w:tcPr>
-            <w:tcW w:w="0" w:type="auto"/>
+            <w:tcW w:w="1954" w:type="dxa"/>
             <w:vAlign w:val="center"/>
             <w:hideMark/>
           </w:tcPr>
@@ -11013,7 +11070,7 @@
         </w:tc>
         <w:tc>
           <w:tcPr>
-            <w:tcW w:w="0" w:type="auto"/>
+            <w:tcW w:w="1813" w:type="dxa"/>
             <w:vAlign w:val="center"/>
             <w:hideMark/>
           </w:tcPr>
@@ -11025,7 +11082,7 @@
         </w:tc>
         <w:tc>
           <w:tcPr>
-            <w:tcW w:w="0" w:type="auto"/>
+            <w:tcW w:w="2081" w:type="dxa"/>
             <w:vAlign w:val="center"/>
             <w:hideMark/>
           </w:tcPr>
@@ -11042,24 +11099,34 @@
         </w:trPr>
         <w:tc>
           <w:tcPr>
-            <w:tcW w:w="0" w:type="auto"/>
+            <w:tcW w:w="1510" w:type="dxa"/>
             <w:vAlign w:val="center"/>
             <w:hideMark/>
           </w:tcPr>
           <w:p>
             <w:proofErr w:type="spellStart"/>
+            <w:proofErr w:type="gramStart"/>
             <w:r>
               <w:t>object</w:t>
             </w:r>
             <w:proofErr w:type="spellEnd"/>
+            <w:proofErr w:type="gramEnd"/>
             <w:r>
-              <w:t xml:space="preserve"> { ... }</w:t>
+              <w:t xml:space="preserve"> </w:t>
+            </w:r>
+            <w:proofErr w:type="gramStart"/>
+            <w:r>
+              <w:t>{ ...</w:t>
+            </w:r>
+            <w:proofErr w:type="gramEnd"/>
+            <w:r>
+              <w:t xml:space="preserve"> }</w:t>
             </w:r>
           </w:p>
         </w:tc>
         <w:tc>
           <w:tcPr>
-            <w:tcW w:w="0" w:type="auto"/>
+            <w:tcW w:w="1529" w:type="dxa"/>
             <w:vAlign w:val="center"/>
             <w:hideMark/>
           </w:tcPr>
@@ -11076,7 +11143,7 @@
         </w:tc>
         <w:tc>
           <w:tcPr>
-            <w:tcW w:w="0" w:type="auto"/>
+            <w:tcW w:w="1954" w:type="dxa"/>
             <w:vAlign w:val="center"/>
             <w:hideMark/>
           </w:tcPr>
@@ -11088,7 +11155,7 @@
         </w:tc>
         <w:tc>
           <w:tcPr>
-            <w:tcW w:w="0" w:type="auto"/>
+            <w:tcW w:w="1813" w:type="dxa"/>
             <w:vAlign w:val="center"/>
             <w:hideMark/>
           </w:tcPr>
@@ -11100,7 +11167,7 @@
         </w:tc>
         <w:tc>
           <w:tcPr>
-            <w:tcW w:w="0" w:type="auto"/>
+            <w:tcW w:w="2081" w:type="dxa"/>
             <w:vAlign w:val="center"/>
             <w:hideMark/>
           </w:tcPr>
@@ -11117,19 +11184,32 @@
         </w:trPr>
         <w:tc>
           <w:tcPr>
-            <w:tcW w:w="0" w:type="auto"/>
+            <w:tcW w:w="1510" w:type="dxa"/>
             <w:vAlign w:val="center"/>
             <w:hideMark/>
           </w:tcPr>
           <w:p>
+            <w:proofErr w:type="gramStart"/>
             <w:r>
-              <w:t>block { ... }</w:t>
+              <w:t>block</w:t>
+            </w:r>
+            <w:proofErr w:type="gramEnd"/>
+            <w:r>
+              <w:t xml:space="preserve"> </w:t>
+            </w:r>
+            <w:proofErr w:type="gramStart"/>
+            <w:r>
+              <w:t>{ ...</w:t>
+            </w:r>
+            <w:proofErr w:type="gramEnd"/>
+            <w:r>
+              <w:t xml:space="preserve"> }</w:t>
             </w:r>
           </w:p>
         </w:tc>
         <w:tc>
           <w:tcPr>
-            <w:tcW w:w="0" w:type="auto"/>
+            <w:tcW w:w="1529" w:type="dxa"/>
             <w:vAlign w:val="center"/>
             <w:hideMark/>
           </w:tcPr>
@@ -11141,7 +11221,7 @@
         </w:tc>
         <w:tc>
           <w:tcPr>
-            <w:tcW w:w="0" w:type="auto"/>
+            <w:tcW w:w="1954" w:type="dxa"/>
             <w:vAlign w:val="center"/>
             <w:hideMark/>
           </w:tcPr>
@@ -11153,7 +11233,7 @@
         </w:tc>
         <w:tc>
           <w:tcPr>
-            <w:tcW w:w="0" w:type="auto"/>
+            <w:tcW w:w="1813" w:type="dxa"/>
             <w:vAlign w:val="center"/>
             <w:hideMark/>
           </w:tcPr>
@@ -11165,7 +11245,7 @@
         </w:tc>
         <w:tc>
           <w:tcPr>
-            <w:tcW w:w="0" w:type="auto"/>
+            <w:tcW w:w="2081" w:type="dxa"/>
             <w:vAlign w:val="center"/>
             <w:hideMark/>
           </w:tcPr>
@@ -11180,7 +11260,7 @@
     <w:p>
       <w:r>
         <w:pict w14:anchorId="4928CF58">
-          <v:rect id="_x0000_i1066" style="width:0;height:1.5pt" o:hralign="center" o:hrstd="t" o:hr="t" fillcolor="#a0a0a0" stroked="f"/>
+          <v:rect id="_x0000_i1062" style="width:0;height:1.5pt" o:hralign="center" o:hrstd="t" o:hr="t" fillcolor="#a0a0a0" stroked="f"/>
         </w:pict>
       </w:r>
     </w:p>
@@ -11254,7 +11334,998 @@
     </w:p>
     <w:p>
       <w:r>
+        <w:lastRenderedPageBreak/>
         <w:pict w14:anchorId="46795D63">
+          <v:rect id="_x0000_i1063" style="width:0;height:1.5pt" o:hralign="center" o:hrstd="t" o:hr="t" fillcolor="#a0a0a0" stroked="f"/>
+        </w:pict>
+      </w:r>
+    </w:p>
+    <w:p>
+      <w:pPr>
+        <w:rPr>
+          <w:b/>
+          <w:bCs/>
+        </w:rPr>
+      </w:pPr>
+      <w:r>
+        <w:rPr>
+          <w:b/>
+          <w:bCs/>
+        </w:rPr>
+        <w:t>12.1 Nœud racine des expressions</w:t>
+      </w:r>
+    </w:p>
+    <w:p>
+      <w:proofErr w:type="spellStart"/>
+      <w:r>
+        <w:t>Expr</w:t>
+      </w:r>
+      <w:proofErr w:type="spellEnd"/>
+    </w:p>
+    <w:p>
+      <w:r>
+        <w:t xml:space="preserve"> </w:t>
+      </w:r>
+      <w:r>
+        <w:rPr>
+          <w:rFonts w:ascii="MS Gothic" w:eastAsia="MS Gothic" w:hAnsi="MS Gothic" w:cs="MS Gothic" w:hint="eastAsia"/>
+        </w:rPr>
+        <w:t>├</w:t>
+      </w:r>
+      <w:r>
+        <w:rPr>
+          <w:rFonts w:ascii="Aptos" w:hAnsi="Aptos" w:cs="Aptos"/>
+        </w:rPr>
+        <w:t>─</w:t>
+      </w:r>
+      <w:r>
+        <w:t xml:space="preserve"> Block(</w:t>
+      </w:r>
+      <w:proofErr w:type="spellStart"/>
+      <w:r>
+        <w:t>ExecutionBlock</w:t>
+      </w:r>
+      <w:proofErr w:type="spellEnd"/>
+      <w:r>
+        <w:t>)</w:t>
+      </w:r>
+    </w:p>
+    <w:p>
+      <w:r>
+        <w:t xml:space="preserve"> </w:t>
+      </w:r>
+      <w:r>
+        <w:rPr>
+          <w:rFonts w:ascii="MS Gothic" w:eastAsia="MS Gothic" w:hAnsi="MS Gothic" w:cs="MS Gothic" w:hint="eastAsia"/>
+        </w:rPr>
+        <w:t>├</w:t>
+      </w:r>
+      <w:r>
+        <w:rPr>
+          <w:rFonts w:ascii="Aptos" w:hAnsi="Aptos" w:cs="Aptos"/>
+        </w:rPr>
+        <w:t>─</w:t>
+      </w:r>
+      <w:r>
+        <w:t xml:space="preserve"> </w:t>
+      </w:r>
+      <w:proofErr w:type="spellStart"/>
+      <w:r>
+        <w:t>Dialect</w:t>
+      </w:r>
+      <w:proofErr w:type="spellEnd"/>
+      <w:r>
+        <w:t>(</w:t>
+      </w:r>
+      <w:proofErr w:type="spellStart"/>
+      <w:r>
+        <w:t>DialectBlock</w:t>
+      </w:r>
+      <w:proofErr w:type="spellEnd"/>
+      <w:r>
+        <w:t>)</w:t>
+      </w:r>
+    </w:p>
+    <w:p>
+      <w:pPr>
+        <w:rPr>
+          <w:lang w:val="en-GB"/>
+        </w:rPr>
+      </w:pPr>
+      <w:r>
+        <w:t xml:space="preserve"> </w:t>
+      </w:r>
+      <w:r>
+        <w:rPr>
+          <w:rFonts w:ascii="MS Gothic" w:eastAsia="MS Gothic" w:hAnsi="MS Gothic" w:cs="MS Gothic" w:hint="eastAsia"/>
+          <w:lang w:val="en-GB"/>
+        </w:rPr>
+        <w:t>├</w:t>
+      </w:r>
+      <w:r>
+        <w:rPr>
+          <w:rFonts w:ascii="Aptos" w:hAnsi="Aptos" w:cs="Aptos"/>
+          <w:lang w:val="en-GB"/>
+        </w:rPr>
+        <w:t>─</w:t>
+      </w:r>
+      <w:r>
+        <w:rPr>
+          <w:lang w:val="en-GB"/>
+        </w:rPr>
+        <w:t xml:space="preserve"> Object(ObjectLiteral)</w:t>
+      </w:r>
+    </w:p>
+    <w:p>
+      <w:pPr>
+        <w:rPr>
+          <w:lang w:val="en-GB"/>
+        </w:rPr>
+      </w:pPr>
+      <w:r>
+        <w:rPr>
+          <w:lang w:val="en-GB"/>
+        </w:rPr>
+        <w:t xml:space="preserve"> </w:t>
+      </w:r>
+      <w:r>
+        <w:rPr>
+          <w:rFonts w:ascii="MS Gothic" w:eastAsia="MS Gothic" w:hAnsi="MS Gothic" w:cs="MS Gothic" w:hint="eastAsia"/>
+          <w:lang w:val="en-GB"/>
+        </w:rPr>
+        <w:t>├</w:t>
+      </w:r>
+      <w:r>
+        <w:rPr>
+          <w:rFonts w:ascii="Aptos" w:hAnsi="Aptos" w:cs="Aptos"/>
+          <w:lang w:val="en-GB"/>
+        </w:rPr>
+        <w:t>─</w:t>
+      </w:r>
+      <w:r>
+        <w:rPr>
+          <w:lang w:val="en-GB"/>
+        </w:rPr>
+        <w:t xml:space="preserve"> ExplicitBlock(ExplicitBlock)</w:t>
+      </w:r>
+    </w:p>
+    <w:p>
+      <w:pPr>
+        <w:rPr>
+          <w:lang w:val="en-GB"/>
+        </w:rPr>
+      </w:pPr>
+      <w:r>
+        <w:rPr>
+          <w:lang w:val="en-GB"/>
+        </w:rPr>
+        <w:t xml:space="preserve"> </w:t>
+      </w:r>
+      <w:r>
+        <w:rPr>
+          <w:rFonts w:ascii="MS Gothic" w:eastAsia="MS Gothic" w:hAnsi="MS Gothic" w:cs="MS Gothic" w:hint="eastAsia"/>
+          <w:lang w:val="en-GB"/>
+        </w:rPr>
+        <w:t>├</w:t>
+      </w:r>
+      <w:r>
+        <w:rPr>
+          <w:rFonts w:ascii="Aptos" w:hAnsi="Aptos" w:cs="Aptos"/>
+          <w:lang w:val="en-GB"/>
+        </w:rPr>
+        <w:t>─</w:t>
+      </w:r>
+      <w:r>
+        <w:rPr>
+          <w:lang w:val="en-GB"/>
+        </w:rPr>
+        <w:t xml:space="preserve"> Call(FunctionCall)</w:t>
+      </w:r>
+    </w:p>
+    <w:p>
+      <w:r>
+        <w:rPr>
+          <w:lang w:val="en-GB"/>
+        </w:rPr>
+        <w:t xml:space="preserve"> </w:t>
+      </w:r>
+      <w:r>
+        <w:rPr>
+          <w:rFonts w:ascii="MS Gothic" w:eastAsia="MS Gothic" w:hAnsi="MS Gothic" w:cs="MS Gothic" w:hint="eastAsia"/>
+        </w:rPr>
+        <w:t>├</w:t>
+      </w:r>
+      <w:r>
+        <w:rPr>
+          <w:rFonts w:ascii="Aptos" w:hAnsi="Aptos" w:cs="Aptos"/>
+        </w:rPr>
+        <w:t>─</w:t>
+      </w:r>
+      <w:r>
+        <w:t xml:space="preserve"> Path(Path)</w:t>
+      </w:r>
+    </w:p>
+    <w:p>
+      <w:r>
+        <w:t xml:space="preserve"> </w:t>
+      </w:r>
+      <w:r>
+        <w:rPr>
+          <w:rFonts w:ascii="MS Gothic" w:eastAsia="MS Gothic" w:hAnsi="MS Gothic" w:cs="MS Gothic" w:hint="eastAsia"/>
+        </w:rPr>
+        <w:t>├</w:t>
+      </w:r>
+      <w:r>
+        <w:rPr>
+          <w:rFonts w:ascii="Aptos" w:hAnsi="Aptos" w:cs="Aptos"/>
+        </w:rPr>
+        <w:t>─</w:t>
+      </w:r>
+      <w:r>
+        <w:t xml:space="preserve"> </w:t>
+      </w:r>
+      <w:proofErr w:type="spellStart"/>
+      <w:r>
+        <w:t>Literal</w:t>
+      </w:r>
+      <w:proofErr w:type="spellEnd"/>
+      <w:r>
+        <w:t>(</w:t>
+      </w:r>
+      <w:proofErr w:type="spellStart"/>
+      <w:r>
+        <w:t>Literal</w:t>
+      </w:r>
+      <w:proofErr w:type="spellEnd"/>
+      <w:r>
+        <w:t>)</w:t>
+      </w:r>
+    </w:p>
+    <w:p>
+      <w:r>
+        <w:t xml:space="preserve"> └─ ...</w:t>
+      </w:r>
+    </w:p>
+    <w:p>
+      <w:r>
+        <w:pict w14:anchorId="390071E9">
+          <v:rect id="_x0000_i1064" style="width:0;height:1.5pt" o:hralign="center" o:hrstd="t" o:hr="t" fillcolor="#a0a0a0" stroked="f"/>
+        </w:pict>
+      </w:r>
+    </w:p>
+    <w:p>
+      <w:pPr>
+        <w:rPr>
+          <w:b/>
+          <w:bCs/>
+        </w:rPr>
+      </w:pPr>
+      <w:r>
+        <w:rPr>
+          <w:b/>
+          <w:bCs/>
+        </w:rPr>
+        <w:t>12.2 Bloc d’exécution</w:t>
+      </w:r>
+    </w:p>
+    <w:p>
+      <w:proofErr w:type="spellStart"/>
+      <w:r>
+        <w:t>ExecutionBlock</w:t>
+      </w:r>
+      <w:proofErr w:type="spellEnd"/>
+    </w:p>
+    <w:p>
+      <w:r>
+        <w:t xml:space="preserve"> </w:t>
+      </w:r>
+      <w:r>
+        <w:rPr>
+          <w:rFonts w:ascii="MS Gothic" w:eastAsia="MS Gothic" w:hAnsi="MS Gothic" w:cs="MS Gothic" w:hint="eastAsia"/>
+        </w:rPr>
+        <w:t>├</w:t>
+      </w:r>
+      <w:r>
+        <w:rPr>
+          <w:rFonts w:ascii="Aptos" w:hAnsi="Aptos" w:cs="Aptos"/>
+        </w:rPr>
+        <w:t>─</w:t>
+      </w:r>
+      <w:r>
+        <w:t xml:space="preserve"> </w:t>
+      </w:r>
+      <w:proofErr w:type="spellStart"/>
+      <w:r>
+        <w:t>statements</w:t>
+      </w:r>
+      <w:proofErr w:type="spellEnd"/>
+      <w:r>
+        <w:t>: Vec&lt;</w:t>
+      </w:r>
+      <w:proofErr w:type="spellStart"/>
+      <w:r>
+        <w:t>Stmt</w:t>
+      </w:r>
+      <w:proofErr w:type="spellEnd"/>
+      <w:r>
+        <w:t>&gt;</w:t>
+      </w:r>
+    </w:p>
+    <w:p>
+      <w:r>
+        <w:t xml:space="preserve"> └─ value: </w:t>
+      </w:r>
+      <w:proofErr w:type="spellStart"/>
+      <w:r>
+        <w:t>Expr</w:t>
+      </w:r>
+      <w:proofErr w:type="spellEnd"/>
+      <w:r>
+        <w:t xml:space="preserve">            // dernière expression du bloc</w:t>
+      </w:r>
+    </w:p>
+    <w:p>
+      <w:pPr>
+        <w:rPr>
+          <w:lang w:val="en-GB"/>
+        </w:rPr>
+      </w:pPr>
+      <w:r>
+        <w:rPr>
+          <w:lang w:val="en-GB"/>
+        </w:rPr>
+        <w:t>Stmt peut représenter :</w:t>
+      </w:r>
+    </w:p>
+    <w:p>
+      <w:pPr>
+        <w:rPr>
+          <w:lang w:val="en-GB"/>
+        </w:rPr>
+      </w:pPr>
+      <w:r>
+        <w:rPr>
+          <w:lang w:val="en-GB"/>
+        </w:rPr>
+        <w:t>Stmt</w:t>
+      </w:r>
+    </w:p>
+    <w:p>
+      <w:pPr>
+        <w:rPr>
+          <w:lang w:val="en-GB"/>
+        </w:rPr>
+      </w:pPr>
+      <w:r>
+        <w:rPr>
+          <w:lang w:val="en-GB"/>
+        </w:rPr>
+        <w:t xml:space="preserve"> </w:t>
+      </w:r>
+      <w:r>
+        <w:rPr>
+          <w:rFonts w:ascii="MS Gothic" w:eastAsia="MS Gothic" w:hAnsi="MS Gothic" w:cs="MS Gothic" w:hint="eastAsia"/>
+          <w:lang w:val="en-GB"/>
+        </w:rPr>
+        <w:t>├</w:t>
+      </w:r>
+      <w:r>
+        <w:rPr>
+          <w:rFonts w:ascii="Aptos" w:hAnsi="Aptos" w:cs="Aptos"/>
+          <w:lang w:val="en-GB"/>
+        </w:rPr>
+        <w:t>─</w:t>
+      </w:r>
+      <w:r>
+        <w:rPr>
+          <w:lang w:val="en-GB"/>
+        </w:rPr>
+        <w:t xml:space="preserve"> Let { name, mutable, type_hint, value }</w:t>
+      </w:r>
+    </w:p>
+    <w:p>
+      <w:pPr>
+        <w:rPr>
+          <w:lang w:val="en-GB"/>
+        </w:rPr>
+      </w:pPr>
+      <w:r>
+        <w:rPr>
+          <w:lang w:val="en-GB"/>
+        </w:rPr>
+        <w:t xml:space="preserve"> </w:t>
+      </w:r>
+      <w:r>
+        <w:rPr>
+          <w:rFonts w:ascii="MS Gothic" w:eastAsia="MS Gothic" w:hAnsi="MS Gothic" w:cs="MS Gothic" w:hint="eastAsia"/>
+          <w:lang w:val="en-GB"/>
+        </w:rPr>
+        <w:t>├</w:t>
+      </w:r>
+      <w:r>
+        <w:rPr>
+          <w:rFonts w:ascii="Aptos" w:hAnsi="Aptos" w:cs="Aptos"/>
+          <w:lang w:val="en-GB"/>
+        </w:rPr>
+        <w:t>─</w:t>
+      </w:r>
+      <w:r>
+        <w:rPr>
+          <w:lang w:val="en-GB"/>
+        </w:rPr>
+        <w:t xml:space="preserve"> Const { name, type_hint, value }</w:t>
+      </w:r>
+    </w:p>
+    <w:p>
+      <w:pPr>
+        <w:rPr>
+          <w:lang w:val="en-GB"/>
+        </w:rPr>
+      </w:pPr>
+      <w:r>
+        <w:rPr>
+          <w:lang w:val="en-GB"/>
+        </w:rPr>
+        <w:t xml:space="preserve"> </w:t>
+      </w:r>
+      <w:r>
+        <w:rPr>
+          <w:rFonts w:ascii="MS Gothic" w:eastAsia="MS Gothic" w:hAnsi="MS Gothic" w:cs="MS Gothic" w:hint="eastAsia"/>
+          <w:lang w:val="en-GB"/>
+        </w:rPr>
+        <w:t>├</w:t>
+      </w:r>
+      <w:r>
+        <w:rPr>
+          <w:rFonts w:ascii="Aptos" w:hAnsi="Aptos" w:cs="Aptos"/>
+          <w:lang w:val="en-GB"/>
+        </w:rPr>
+        <w:t>─</w:t>
+      </w:r>
+      <w:r>
+        <w:rPr>
+          <w:lang w:val="en-GB"/>
+        </w:rPr>
+        <w:t xml:space="preserve"> Assign { target: Path, value: Expr }</w:t>
+      </w:r>
+    </w:p>
+    <w:p>
+      <w:r>
+        <w:rPr>
+          <w:lang w:val="en-GB"/>
+        </w:rPr>
+        <w:t xml:space="preserve"> </w:t>
+      </w:r>
+      <w:r>
+        <w:t xml:space="preserve">└─ </w:t>
+      </w:r>
+      <w:proofErr w:type="spellStart"/>
+      <w:r>
+        <w:t>ExprStmt</w:t>
+      </w:r>
+      <w:proofErr w:type="spellEnd"/>
+      <w:r>
+        <w:t>(</w:t>
+      </w:r>
+      <w:proofErr w:type="spellStart"/>
+      <w:r>
+        <w:t>Expr</w:t>
+      </w:r>
+      <w:proofErr w:type="spellEnd"/>
+      <w:r>
+        <w:t>)         // expression utilisée comme instruction</w:t>
+      </w:r>
+    </w:p>
+    <w:p>
+      <w:r>
+        <w:pict w14:anchorId="611ED467">
+          <v:rect id="_x0000_i1065" style="width:0;height:1.5pt" o:hralign="center" o:hrstd="t" o:hr="t" fillcolor="#a0a0a0" stroked="f"/>
+        </w:pict>
+      </w:r>
+    </w:p>
+    <w:p>
+      <w:pPr>
+        <w:rPr>
+          <w:b/>
+          <w:bCs/>
+        </w:rPr>
+      </w:pPr>
+      <w:r>
+        <w:rPr>
+          <w:b/>
+          <w:bCs/>
+        </w:rPr>
+        <w:t>12.3 Bloc dialecte</w:t>
+      </w:r>
+    </w:p>
+    <w:p>
+      <w:proofErr w:type="spellStart"/>
+      <w:r>
+        <w:t>DialectBlock</w:t>
+      </w:r>
+      <w:proofErr w:type="spellEnd"/>
+    </w:p>
+    <w:p>
+      <w:r>
+        <w:t xml:space="preserve"> └─ </w:t>
+      </w:r>
+      <w:proofErr w:type="spellStart"/>
+      <w:r>
+        <w:t>lines</w:t>
+      </w:r>
+      <w:proofErr w:type="spellEnd"/>
+      <w:r>
+        <w:t>: Vec&lt;</w:t>
+      </w:r>
+      <w:proofErr w:type="spellStart"/>
+      <w:r>
+        <w:t>DialectLine</w:t>
+      </w:r>
+      <w:proofErr w:type="spellEnd"/>
+      <w:r>
+        <w:t>&gt;</w:t>
+      </w:r>
+    </w:p>
+    <w:p>
+      <w:proofErr w:type="spellStart"/>
+      <w:r>
+        <w:t>DialectLine</w:t>
+      </w:r>
+      <w:proofErr w:type="spellEnd"/>
+    </w:p>
+    <w:p>
+      <w:r>
+        <w:lastRenderedPageBreak/>
+        <w:t xml:space="preserve"> </w:t>
+      </w:r>
+      <w:r>
+        <w:rPr>
+          <w:rFonts w:ascii="MS Gothic" w:eastAsia="MS Gothic" w:hAnsi="MS Gothic" w:cs="MS Gothic" w:hint="eastAsia"/>
+        </w:rPr>
+        <w:t>├</w:t>
+      </w:r>
+      <w:r>
+        <w:rPr>
+          <w:rFonts w:ascii="Aptos" w:hAnsi="Aptos" w:cs="Aptos"/>
+        </w:rPr>
+        <w:t>─</w:t>
+      </w:r>
+      <w:r>
+        <w:t xml:space="preserve"> command: </w:t>
+      </w:r>
+      <w:proofErr w:type="spellStart"/>
+      <w:r>
+        <w:t>KebabIdent</w:t>
+      </w:r>
+      <w:proofErr w:type="spellEnd"/>
+    </w:p>
+    <w:p>
+      <w:r>
+        <w:t xml:space="preserve"> └─ args: Vec&lt;</w:t>
+      </w:r>
+      <w:proofErr w:type="spellStart"/>
+      <w:r>
+        <w:t>DialectArg</w:t>
+      </w:r>
+      <w:proofErr w:type="spellEnd"/>
+      <w:r>
+        <w:t>&gt;</w:t>
+      </w:r>
+    </w:p>
+    <w:p>
+      <w:pPr>
+        <w:rPr>
+          <w:lang w:val="en-GB"/>
+        </w:rPr>
+      </w:pPr>
+      <w:r>
+        <w:rPr>
+          <w:lang w:val="en-GB"/>
+        </w:rPr>
+        <w:t>DialectArg</w:t>
+      </w:r>
+    </w:p>
+    <w:p>
+      <w:pPr>
+        <w:rPr>
+          <w:lang w:val="en-GB"/>
+        </w:rPr>
+      </w:pPr>
+      <w:r>
+        <w:rPr>
+          <w:lang w:val="en-GB"/>
+        </w:rPr>
+        <w:t xml:space="preserve"> </w:t>
+      </w:r>
+      <w:r>
+        <w:rPr>
+          <w:rFonts w:ascii="MS Gothic" w:eastAsia="MS Gothic" w:hAnsi="MS Gothic" w:cs="MS Gothic" w:hint="eastAsia"/>
+          <w:lang w:val="en-GB"/>
+        </w:rPr>
+        <w:t>├</w:t>
+      </w:r>
+      <w:r>
+        <w:rPr>
+          <w:rFonts w:ascii="Aptos" w:hAnsi="Aptos" w:cs="Aptos"/>
+          <w:lang w:val="en-GB"/>
+        </w:rPr>
+        <w:t>─</w:t>
+      </w:r>
+      <w:r>
+        <w:rPr>
+          <w:lang w:val="en-GB"/>
+        </w:rPr>
+        <w:t xml:space="preserve"> Literal(Literal)</w:t>
+      </w:r>
+    </w:p>
+    <w:p>
+      <w:pPr>
+        <w:rPr>
+          <w:lang w:val="en-GB"/>
+        </w:rPr>
+      </w:pPr>
+      <w:r>
+        <w:rPr>
+          <w:lang w:val="en-GB"/>
+        </w:rPr>
+        <w:t xml:space="preserve"> </w:t>
+      </w:r>
+      <w:r>
+        <w:rPr>
+          <w:rFonts w:ascii="MS Gothic" w:eastAsia="MS Gothic" w:hAnsi="MS Gothic" w:cs="MS Gothic" w:hint="eastAsia"/>
+          <w:lang w:val="en-GB"/>
+        </w:rPr>
+        <w:t>├</w:t>
+      </w:r>
+      <w:r>
+        <w:rPr>
+          <w:rFonts w:ascii="Aptos" w:hAnsi="Aptos" w:cs="Aptos"/>
+          <w:lang w:val="en-GB"/>
+        </w:rPr>
+        <w:t>─</w:t>
+      </w:r>
+      <w:r>
+        <w:rPr>
+          <w:lang w:val="en-GB"/>
+        </w:rPr>
+        <w:t xml:space="preserve"> Path(Path)</w:t>
+      </w:r>
+    </w:p>
+    <w:p>
+      <w:r>
+        <w:rPr>
+          <w:lang w:val="en-GB"/>
+        </w:rPr>
+        <w:t xml:space="preserve"> </w:t>
+      </w:r>
+      <w:r>
+        <w:t xml:space="preserve">└─ </w:t>
+      </w:r>
+      <w:proofErr w:type="spellStart"/>
+      <w:r>
+        <w:t>Ident</w:t>
+      </w:r>
+      <w:proofErr w:type="spellEnd"/>
+      <w:r>
+        <w:t>(</w:t>
+      </w:r>
+      <w:proofErr w:type="spellStart"/>
+      <w:r>
+        <w:t>Ident</w:t>
+      </w:r>
+      <w:proofErr w:type="spellEnd"/>
+      <w:r>
+        <w:t>)</w:t>
+      </w:r>
+    </w:p>
+    <w:p>
+      <w:r>
+        <w:pict w14:anchorId="76C76EAC">
+          <v:rect id="_x0000_i1066" style="width:0;height:1.5pt" o:hralign="center" o:hrstd="t" o:hr="t" fillcolor="#a0a0a0" stroked="f"/>
+        </w:pict>
+      </w:r>
+    </w:p>
+    <w:p>
+      <w:pPr>
+        <w:rPr>
+          <w:b/>
+          <w:bCs/>
+          <w:lang w:val="en-GB"/>
+        </w:rPr>
+      </w:pPr>
+      <w:r>
+        <w:rPr>
+          <w:b/>
+          <w:bCs/>
+          <w:lang w:val="en-GB"/>
+        </w:rPr>
+        <w:t>12.4 Bloc objet</w:t>
+      </w:r>
+    </w:p>
+    <w:p>
+      <w:pPr>
+        <w:rPr>
+          <w:lang w:val="en-GB"/>
+        </w:rPr>
+      </w:pPr>
+      <w:r>
+        <w:rPr>
+          <w:lang w:val="en-GB"/>
+        </w:rPr>
+        <w:t>ObjectLiteral</w:t>
+      </w:r>
+    </w:p>
+    <w:p>
+      <w:pPr>
+        <w:rPr>
+          <w:lang w:val="en-GB"/>
+        </w:rPr>
+      </w:pPr>
+      <w:r>
+        <w:rPr>
+          <w:lang w:val="en-GB"/>
+        </w:rPr>
+        <w:t xml:space="preserve"> └─ fields: Vec&lt;ObjectField&gt;</w:t>
+      </w:r>
+    </w:p>
+    <w:p>
+      <w:pPr>
+        <w:rPr>
+          <w:lang w:val="en-GB"/>
+        </w:rPr>
+      </w:pPr>
+      <w:r>
+        <w:rPr>
+          <w:lang w:val="en-GB"/>
+        </w:rPr>
+        <w:t>ObjectField</w:t>
+      </w:r>
+    </w:p>
+    <w:p>
+      <w:pPr>
+        <w:rPr>
+          <w:lang w:val="en-GB"/>
+        </w:rPr>
+      </w:pPr>
+      <w:r>
+        <w:rPr>
+          <w:lang w:val="en-GB"/>
+        </w:rPr>
+        <w:t xml:space="preserve"> </w:t>
+      </w:r>
+      <w:r>
+        <w:rPr>
+          <w:rFonts w:ascii="MS Gothic" w:eastAsia="MS Gothic" w:hAnsi="MS Gothic" w:cs="MS Gothic" w:hint="eastAsia"/>
+          <w:lang w:val="en-GB"/>
+        </w:rPr>
+        <w:t>├</w:t>
+      </w:r>
+      <w:r>
+        <w:rPr>
+          <w:rFonts w:ascii="Aptos" w:hAnsi="Aptos" w:cs="Aptos"/>
+          <w:lang w:val="en-GB"/>
+        </w:rPr>
+        <w:t>─</w:t>
+      </w:r>
+      <w:r>
+        <w:rPr>
+          <w:lang w:val="en-GB"/>
+        </w:rPr>
+        <w:t xml:space="preserve"> Field {</w:t>
+      </w:r>
+    </w:p>
+    <w:p>
+      <w:pPr>
+        <w:rPr>
+          <w:lang w:val="en-GB"/>
+        </w:rPr>
+      </w:pPr>
+      <w:r>
+        <w:rPr>
+          <w:lang w:val="en-GB"/>
+        </w:rPr>
+        <w:t xml:space="preserve"> │    name: Ident,</w:t>
+      </w:r>
+    </w:p>
+    <w:p>
+      <w:pPr>
+        <w:rPr>
+          <w:lang w:val="en-GB"/>
+        </w:rPr>
+      </w:pPr>
+      <w:r>
+        <w:rPr>
+          <w:lang w:val="en-GB"/>
+        </w:rPr>
+        <w:t xml:space="preserve"> │    type_hint: Type,</w:t>
+      </w:r>
+    </w:p>
+    <w:p>
+      <w:pPr>
+        <w:rPr>
+          <w:lang w:val="en-GB"/>
+        </w:rPr>
+      </w:pPr>
+      <w:r>
+        <w:rPr>
+          <w:lang w:val="en-GB"/>
+        </w:rPr>
+        <w:t xml:space="preserve"> │    value: Expr</w:t>
+      </w:r>
+    </w:p>
+    <w:p>
+      <w:pPr>
+        <w:rPr>
+          <w:lang w:val="en-GB"/>
+        </w:rPr>
+      </w:pPr>
+      <w:r>
+        <w:rPr>
+          <w:lang w:val="en-GB"/>
+        </w:rPr>
+        <w:t xml:space="preserve"> │  }</w:t>
+      </w:r>
+    </w:p>
+    <w:p>
+      <w:pPr>
+        <w:rPr>
+          <w:lang w:val="en-GB"/>
+        </w:rPr>
+      </w:pPr>
+      <w:r>
+        <w:rPr>
+          <w:lang w:val="en-GB"/>
+        </w:rPr>
+        <w:t xml:space="preserve"> └─ Method {</w:t>
+      </w:r>
+    </w:p>
+    <w:p>
+      <w:pPr>
+        <w:rPr>
+          <w:lang w:val="en-GB"/>
+        </w:rPr>
+      </w:pPr>
+      <w:r>
+        <w:rPr>
+          <w:lang w:val="en-GB"/>
+        </w:rPr>
+        <w:t xml:space="preserve">      name: Ident,</w:t>
+      </w:r>
+    </w:p>
+    <w:p>
+      <w:pPr>
+        <w:rPr>
+          <w:lang w:val="en-GB"/>
+        </w:rPr>
+      </w:pPr>
+      <w:r>
+        <w:rPr>
+          <w:lang w:val="en-GB"/>
+        </w:rPr>
+        <w:t xml:space="preserve">      func: FunctionDef</w:t>
+      </w:r>
+    </w:p>
+    <w:p>
+      <w:pPr>
+        <w:rPr>
+          <w:lang w:val="en-GB"/>
+        </w:rPr>
+      </w:pPr>
+      <w:r>
+        <w:rPr>
+          <w:lang w:val="en-GB"/>
+        </w:rPr>
+        <w:t xml:space="preserve">    }</w:t>
+      </w:r>
+    </w:p>
+    <w:p>
+      <w:pPr>
+        <w:rPr>
+          <w:lang w:val="en-GB"/>
+        </w:rPr>
+      </w:pPr>
+      <w:r>
+        <w:rPr>
+          <w:lang w:val="en-GB"/>
+        </w:rPr>
+        <w:t>FunctionDef :</w:t>
+      </w:r>
+    </w:p>
+    <w:p>
+      <w:pPr>
+        <w:rPr>
+          <w:lang w:val="en-GB"/>
+        </w:rPr>
+      </w:pPr>
+      <w:r>
+        <w:rPr>
+          <w:lang w:val="en-GB"/>
+        </w:rPr>
+        <w:t>FunctionDef</w:t>
+      </w:r>
+    </w:p>
+    <w:p>
+      <w:pPr>
+        <w:rPr>
+          <w:lang w:val="en-GB"/>
+        </w:rPr>
+      </w:pPr>
+      <w:r>
+        <w:rPr>
+          <w:lang w:val="en-GB"/>
+        </w:rPr>
+        <w:t xml:space="preserve"> </w:t>
+      </w:r>
+      <w:r>
+        <w:rPr>
+          <w:rFonts w:ascii="MS Gothic" w:eastAsia="MS Gothic" w:hAnsi="MS Gothic" w:cs="MS Gothic" w:hint="eastAsia"/>
+          <w:lang w:val="en-GB"/>
+        </w:rPr>
+        <w:t>├</w:t>
+      </w:r>
+      <w:r>
+        <w:rPr>
+          <w:rFonts w:ascii="Aptos" w:hAnsi="Aptos" w:cs="Aptos"/>
+          <w:lang w:val="en-GB"/>
+        </w:rPr>
+        <w:t>─</w:t>
+      </w:r>
+      <w:r>
+        <w:rPr>
+          <w:lang w:val="en-GB"/>
+        </w:rPr>
+        <w:t xml:space="preserve"> params: Vec&lt;Param&gt;</w:t>
+      </w:r>
+    </w:p>
+    <w:p>
+      <w:pPr>
+        <w:rPr>
+          <w:lang w:val="en-GB"/>
+        </w:rPr>
+      </w:pPr>
+      <w:r>
+        <w:rPr>
+          <w:lang w:val="en-GB"/>
+        </w:rPr>
+        <w:t xml:space="preserve"> </w:t>
+      </w:r>
+      <w:r>
+        <w:rPr>
+          <w:rFonts w:ascii="MS Gothic" w:eastAsia="MS Gothic" w:hAnsi="MS Gothic" w:cs="MS Gothic" w:hint="eastAsia"/>
+          <w:lang w:val="en-GB"/>
+        </w:rPr>
+        <w:t>├</w:t>
+      </w:r>
+      <w:r>
+        <w:rPr>
+          <w:rFonts w:ascii="Aptos" w:hAnsi="Aptos" w:cs="Aptos"/>
+          <w:lang w:val="en-GB"/>
+        </w:rPr>
+        <w:t>─</w:t>
+      </w:r>
+      <w:r>
+        <w:rPr>
+          <w:lang w:val="en-GB"/>
+        </w:rPr>
+        <w:t xml:space="preserve"> return_type: Option&lt;Type&gt;</w:t>
+      </w:r>
+    </w:p>
+    <w:p>
+      <w:pPr>
+        <w:rPr>
+          <w:lang w:val="en-GB"/>
+        </w:rPr>
+      </w:pPr>
+      <w:r>
+        <w:rPr>
+          <w:lang w:val="en-GB"/>
+        </w:rPr>
+        <w:t xml:space="preserve"> └─ body: ExecutionBlock</w:t>
+      </w:r>
+    </w:p>
+    <w:p>
+      <w:r>
+        <w:pict w14:anchorId="5BEDB4F8">
           <v:rect id="_x0000_i1067" style="width:0;height:1.5pt" o:hralign="center" o:hrstd="t" o:hr="t" fillcolor="#a0a0a0" stroked="f"/>
         </w:pict>
       </w:r>
@@ -11271,35 +12342,30 @@
           <w:b/>
           <w:bCs/>
         </w:rPr>
+        <w:t>12.5 Bloc explicite</w:t>
+      </w:r>
+    </w:p>
+    <w:p>
+      <w:proofErr w:type="spellStart"/>
+      <w:r>
+        <w:t>ExplicitBlock</w:t>
+      </w:r>
+      <w:proofErr w:type="spellEnd"/>
+    </w:p>
+    <w:p>
+      <w:r>
         <w:lastRenderedPageBreak/>
-        <w:t>12.1 Nœud racine des expressions</w:t>
-      </w:r>
-    </w:p>
-    <w:p>
+        <w:t xml:space="preserve"> └─ body: </w:t>
+      </w:r>
       <w:proofErr w:type="spellStart"/>
       <w:r>
-        <w:t>Expr</w:t>
+        <w:t>ExecutionBlock</w:t>
       </w:r>
       <w:proofErr w:type="spellEnd"/>
     </w:p>
     <w:p>
       <w:r>
-        <w:t xml:space="preserve"> </w:t>
-      </w:r>
-      <w:r>
-        <w:rPr>
-          <w:rFonts w:ascii="MS Gothic" w:eastAsia="MS Gothic" w:hAnsi="MS Gothic" w:cs="MS Gothic" w:hint="eastAsia"/>
-        </w:rPr>
-        <w:t>├</w:t>
-      </w:r>
-      <w:r>
-        <w:rPr>
-          <w:rFonts w:ascii="Aptos" w:hAnsi="Aptos" w:cs="Aptos"/>
-        </w:rPr>
-        <w:t>─</w:t>
-      </w:r>
-      <w:r>
-        <w:t xml:space="preserve"> Block(</w:t>
+        <w:t xml:space="preserve">Dans l’AST, un bloc explicite est donc un nœud distinct, mais réutilise la même structure interne que </w:t>
       </w:r>
       <w:proofErr w:type="spellStart"/>
       <w:r>
@@ -11307,208 +12373,12 @@
       </w:r>
       <w:proofErr w:type="spellEnd"/>
       <w:r>
-        <w:t>)</w:t>
-      </w:r>
-    </w:p>
-    <w:p>
-      <w:r>
-        <w:t xml:space="preserve"> </w:t>
-      </w:r>
-      <w:r>
-        <w:rPr>
-          <w:rFonts w:ascii="MS Gothic" w:eastAsia="MS Gothic" w:hAnsi="MS Gothic" w:cs="MS Gothic" w:hint="eastAsia"/>
-        </w:rPr>
-        <w:t>├</w:t>
-      </w:r>
-      <w:r>
-        <w:rPr>
-          <w:rFonts w:ascii="Aptos" w:hAnsi="Aptos" w:cs="Aptos"/>
-        </w:rPr>
-        <w:t>─</w:t>
-      </w:r>
-      <w:r>
-        <w:t xml:space="preserve"> </w:t>
-      </w:r>
-      <w:proofErr w:type="spellStart"/>
-      <w:r>
-        <w:t>Dialect</w:t>
-      </w:r>
-      <w:proofErr w:type="spellEnd"/>
-      <w:r>
-        <w:t>(</w:t>
-      </w:r>
-      <w:proofErr w:type="spellStart"/>
-      <w:r>
-        <w:t>DialectBlock</w:t>
-      </w:r>
-      <w:proofErr w:type="spellEnd"/>
-      <w:r>
-        <w:t>)</w:t>
-      </w:r>
-    </w:p>
-    <w:p>
-      <w:pPr>
-        <w:rPr>
-          <w:lang w:val="en-GB"/>
-        </w:rPr>
-      </w:pPr>
-      <w:r>
-        <w:t xml:space="preserve"> </w:t>
-      </w:r>
-      <w:r>
-        <w:rPr>
-          <w:rFonts w:ascii="MS Gothic" w:eastAsia="MS Gothic" w:hAnsi="MS Gothic" w:cs="MS Gothic" w:hint="eastAsia"/>
-          <w:lang w:val="en-GB"/>
-        </w:rPr>
-        <w:t>├</w:t>
-      </w:r>
-      <w:r>
-        <w:rPr>
-          <w:rFonts w:ascii="Aptos" w:hAnsi="Aptos" w:cs="Aptos"/>
-          <w:lang w:val="en-GB"/>
-        </w:rPr>
-        <w:t>─</w:t>
-      </w:r>
-      <w:r>
-        <w:rPr>
-          <w:lang w:val="en-GB"/>
-        </w:rPr>
-        <w:t xml:space="preserve"> Object(ObjectLiteral)</w:t>
-      </w:r>
-    </w:p>
-    <w:p>
-      <w:pPr>
-        <w:rPr>
-          <w:lang w:val="en-GB"/>
-        </w:rPr>
-      </w:pPr>
-      <w:r>
-        <w:rPr>
-          <w:lang w:val="en-GB"/>
-        </w:rPr>
-        <w:t xml:space="preserve"> </w:t>
-      </w:r>
-      <w:r>
-        <w:rPr>
-          <w:rFonts w:ascii="MS Gothic" w:eastAsia="MS Gothic" w:hAnsi="MS Gothic" w:cs="MS Gothic" w:hint="eastAsia"/>
-          <w:lang w:val="en-GB"/>
-        </w:rPr>
-        <w:t>├</w:t>
-      </w:r>
-      <w:r>
-        <w:rPr>
-          <w:rFonts w:ascii="Aptos" w:hAnsi="Aptos" w:cs="Aptos"/>
-          <w:lang w:val="en-GB"/>
-        </w:rPr>
-        <w:t>─</w:t>
-      </w:r>
-      <w:r>
-        <w:rPr>
-          <w:lang w:val="en-GB"/>
-        </w:rPr>
-        <w:t xml:space="preserve"> ExplicitBlock(ExplicitBlock)</w:t>
-      </w:r>
-    </w:p>
-    <w:p>
-      <w:pPr>
-        <w:rPr>
-          <w:lang w:val="en-GB"/>
-        </w:rPr>
-      </w:pPr>
-      <w:r>
-        <w:rPr>
-          <w:lang w:val="en-GB"/>
-        </w:rPr>
-        <w:t xml:space="preserve"> </w:t>
-      </w:r>
-      <w:r>
-        <w:rPr>
-          <w:rFonts w:ascii="MS Gothic" w:eastAsia="MS Gothic" w:hAnsi="MS Gothic" w:cs="MS Gothic" w:hint="eastAsia"/>
-          <w:lang w:val="en-GB"/>
-        </w:rPr>
-        <w:t>├</w:t>
-      </w:r>
-      <w:r>
-        <w:rPr>
-          <w:rFonts w:ascii="Aptos" w:hAnsi="Aptos" w:cs="Aptos"/>
-          <w:lang w:val="en-GB"/>
-        </w:rPr>
-        <w:t>─</w:t>
-      </w:r>
-      <w:r>
-        <w:rPr>
-          <w:lang w:val="en-GB"/>
-        </w:rPr>
-        <w:t xml:space="preserve"> Call(FunctionCall)</w:t>
-      </w:r>
-    </w:p>
-    <w:p>
-      <w:r>
-        <w:rPr>
-          <w:lang w:val="en-GB"/>
-        </w:rPr>
-        <w:t xml:space="preserve"> </w:t>
-      </w:r>
-      <w:r>
-        <w:rPr>
-          <w:rFonts w:ascii="MS Gothic" w:eastAsia="MS Gothic" w:hAnsi="MS Gothic" w:cs="MS Gothic" w:hint="eastAsia"/>
-        </w:rPr>
-        <w:t>├</w:t>
-      </w:r>
-      <w:r>
-        <w:rPr>
-          <w:rFonts w:ascii="Aptos" w:hAnsi="Aptos" w:cs="Aptos"/>
-        </w:rPr>
-        <w:t>─</w:t>
-      </w:r>
-      <w:r>
-        <w:t xml:space="preserve"> Path(Path)</w:t>
-      </w:r>
-    </w:p>
-    <w:p>
-      <w:r>
-        <w:t xml:space="preserve"> </w:t>
-      </w:r>
-      <w:r>
-        <w:rPr>
-          <w:rFonts w:ascii="MS Gothic" w:eastAsia="MS Gothic" w:hAnsi="MS Gothic" w:cs="MS Gothic" w:hint="eastAsia"/>
-        </w:rPr>
-        <w:t>├</w:t>
-      </w:r>
-      <w:r>
-        <w:rPr>
-          <w:rFonts w:ascii="Aptos" w:hAnsi="Aptos" w:cs="Aptos"/>
-        </w:rPr>
-        <w:t>─</w:t>
-      </w:r>
-      <w:r>
-        <w:t xml:space="preserve"> </w:t>
-      </w:r>
-      <w:proofErr w:type="spellStart"/>
-      <w:r>
-        <w:t>Literal</w:t>
-      </w:r>
-      <w:proofErr w:type="spellEnd"/>
-      <w:r>
-        <w:t>(</w:t>
-      </w:r>
-      <w:proofErr w:type="spellStart"/>
-      <w:r>
-        <w:t>Literal</w:t>
-      </w:r>
-      <w:proofErr w:type="spellEnd"/>
-      <w:r>
-        <w:t>)</w:t>
-      </w:r>
-    </w:p>
-    <w:p>
-      <w:r>
-        <w:t xml:space="preserve"> └─ ...</w:t>
-      </w:r>
-    </w:p>
-    <w:p>
-      <w:r>
-        <w:pict w14:anchorId="390071E9">
+        <w:t>.</w:t>
+      </w:r>
+    </w:p>
+    <w:p>
+      <w:r>
+        <w:pict w14:anchorId="49446AEE">
           <v:rect id="_x0000_i1068" style="width:0;height:1.5pt" o:hralign="center" o:hrstd="t" o:hr="t" fillcolor="#a0a0a0" stroked="f"/>
         </w:pict>
       </w:r>
@@ -11525,1082 +12395,293 @@
           <w:b/>
           <w:bCs/>
         </w:rPr>
-        <w:t>12.2 Bloc d’exécution</w:t>
-      </w:r>
-    </w:p>
-    <w:p>
-      <w:proofErr w:type="spellStart"/>
-      <w:r>
-        <w:t>ExecutionBlock</w:t>
-      </w:r>
-      <w:proofErr w:type="spellEnd"/>
-    </w:p>
-    <w:p>
-      <w:r>
-        <w:t xml:space="preserve"> </w:t>
-      </w:r>
-      <w:r>
-        <w:rPr>
-          <w:rFonts w:ascii="MS Gothic" w:eastAsia="MS Gothic" w:hAnsi="MS Gothic" w:cs="MS Gothic" w:hint="eastAsia"/>
-        </w:rPr>
-        <w:t>├</w:t>
-      </w:r>
-      <w:r>
-        <w:rPr>
-          <w:rFonts w:ascii="Aptos" w:hAnsi="Aptos" w:cs="Aptos"/>
-        </w:rPr>
-        <w:t>─</w:t>
-      </w:r>
-      <w:r>
-        <w:t xml:space="preserve"> </w:t>
-      </w:r>
-      <w:proofErr w:type="spellStart"/>
-      <w:r>
-        <w:t>statements</w:t>
-      </w:r>
-      <w:proofErr w:type="spellEnd"/>
-      <w:r>
-        <w:t>: Vec&lt;</w:t>
-      </w:r>
-      <w:proofErr w:type="spellStart"/>
-      <w:r>
-        <w:t>Stmt</w:t>
-      </w:r>
-      <w:proofErr w:type="spellEnd"/>
-      <w:r>
-        <w:t>&gt;</w:t>
-      </w:r>
-    </w:p>
-    <w:p>
-      <w:r>
-        <w:t xml:space="preserve"> └─ value: </w:t>
-      </w:r>
-      <w:proofErr w:type="spellStart"/>
-      <w:r>
-        <w:t>Expr</w:t>
-      </w:r>
-      <w:proofErr w:type="spellEnd"/>
-      <w:r>
-        <w:t xml:space="preserve">            // dernière expression du bloc</w:t>
-      </w:r>
-    </w:p>
-    <w:p>
-      <w:pPr>
-        <w:rPr>
-          <w:lang w:val="en-GB"/>
-        </w:rPr>
-      </w:pPr>
-      <w:r>
-        <w:rPr>
-          <w:lang w:val="en-GB"/>
-        </w:rPr>
-        <w:t>Stmt peut représenter :</w:t>
-      </w:r>
-    </w:p>
-    <w:p>
-      <w:pPr>
-        <w:rPr>
-          <w:lang w:val="en-GB"/>
-        </w:rPr>
-      </w:pPr>
-      <w:r>
-        <w:rPr>
-          <w:lang w:val="en-GB"/>
-        </w:rPr>
-        <w:t>Stmt</w:t>
-      </w:r>
-    </w:p>
-    <w:p>
-      <w:pPr>
-        <w:rPr>
-          <w:lang w:val="en-GB"/>
-        </w:rPr>
-      </w:pPr>
-      <w:r>
-        <w:rPr>
-          <w:lang w:val="en-GB"/>
-        </w:rPr>
-        <w:t xml:space="preserve"> </w:t>
-      </w:r>
-      <w:r>
-        <w:rPr>
-          <w:rFonts w:ascii="MS Gothic" w:eastAsia="MS Gothic" w:hAnsi="MS Gothic" w:cs="MS Gothic" w:hint="eastAsia"/>
-          <w:lang w:val="en-GB"/>
-        </w:rPr>
-        <w:t>├</w:t>
-      </w:r>
-      <w:r>
-        <w:rPr>
-          <w:rFonts w:ascii="Aptos" w:hAnsi="Aptos" w:cs="Aptos"/>
-          <w:lang w:val="en-GB"/>
-        </w:rPr>
-        <w:t>─</w:t>
-      </w:r>
-      <w:r>
-        <w:rPr>
-          <w:lang w:val="en-GB"/>
-        </w:rPr>
-        <w:t xml:space="preserve"> Let { name, mutable, type_hint, value }</w:t>
-      </w:r>
-    </w:p>
-    <w:p>
-      <w:pPr>
-        <w:rPr>
-          <w:lang w:val="en-GB"/>
-        </w:rPr>
-      </w:pPr>
-      <w:r>
-        <w:rPr>
-          <w:lang w:val="en-GB"/>
-        </w:rPr>
-        <w:t xml:space="preserve"> </w:t>
-      </w:r>
-      <w:r>
-        <w:rPr>
-          <w:rFonts w:ascii="MS Gothic" w:eastAsia="MS Gothic" w:hAnsi="MS Gothic" w:cs="MS Gothic" w:hint="eastAsia"/>
-          <w:lang w:val="en-GB"/>
-        </w:rPr>
-        <w:t>├</w:t>
-      </w:r>
-      <w:r>
-        <w:rPr>
-          <w:rFonts w:ascii="Aptos" w:hAnsi="Aptos" w:cs="Aptos"/>
-          <w:lang w:val="en-GB"/>
-        </w:rPr>
-        <w:t>─</w:t>
-      </w:r>
-      <w:r>
-        <w:rPr>
-          <w:lang w:val="en-GB"/>
-        </w:rPr>
-        <w:t xml:space="preserve"> Const { name, type_hint, value }</w:t>
-      </w:r>
-    </w:p>
-    <w:p>
-      <w:pPr>
-        <w:rPr>
-          <w:lang w:val="en-GB"/>
-        </w:rPr>
-      </w:pPr>
-      <w:r>
-        <w:rPr>
-          <w:lang w:val="en-GB"/>
-        </w:rPr>
-        <w:t xml:space="preserve"> </w:t>
-      </w:r>
-      <w:r>
-        <w:rPr>
-          <w:rFonts w:ascii="MS Gothic" w:eastAsia="MS Gothic" w:hAnsi="MS Gothic" w:cs="MS Gothic" w:hint="eastAsia"/>
-          <w:lang w:val="en-GB"/>
-        </w:rPr>
-        <w:t>├</w:t>
-      </w:r>
-      <w:r>
-        <w:rPr>
-          <w:rFonts w:ascii="Aptos" w:hAnsi="Aptos" w:cs="Aptos"/>
-          <w:lang w:val="en-GB"/>
-        </w:rPr>
-        <w:t>─</w:t>
-      </w:r>
-      <w:r>
-        <w:rPr>
-          <w:lang w:val="en-GB"/>
-        </w:rPr>
-        <w:t xml:space="preserve"> Assign { target: Path, value: Expr }</w:t>
-      </w:r>
-    </w:p>
-    <w:p>
-      <w:r>
-        <w:rPr>
-          <w:lang w:val="en-GB"/>
-        </w:rPr>
-        <w:t xml:space="preserve"> </w:t>
-      </w:r>
-      <w:r>
-        <w:t xml:space="preserve">└─ </w:t>
-      </w:r>
-      <w:proofErr w:type="spellStart"/>
-      <w:r>
-        <w:t>ExprStmt</w:t>
-      </w:r>
-      <w:proofErr w:type="spellEnd"/>
-      <w:r>
-        <w:t>(</w:t>
-      </w:r>
-      <w:proofErr w:type="spellStart"/>
-      <w:r>
-        <w:t>Expr</w:t>
-      </w:r>
-      <w:proofErr w:type="spellEnd"/>
-      <w:r>
-        <w:t>)         // expression utilisée comme instruction</w:t>
-      </w:r>
-    </w:p>
-    <w:p>
-      <w:r>
-        <w:pict w14:anchorId="611ED467">
-          <v:rect id="_x0000_i1069" style="width:0;height:1.5pt" o:hralign="center" o:hrstd="t" o:hr="t" fillcolor="#a0a0a0" stroked="f"/>
-        </w:pict>
-      </w:r>
-    </w:p>
-    <w:p>
-      <w:pPr>
-        <w:rPr>
-          <w:b/>
-          <w:bCs/>
-        </w:rPr>
-      </w:pPr>
-      <w:r>
-        <w:rPr>
-          <w:b/>
-          <w:bCs/>
-        </w:rPr>
-        <w:t>12.3 Bloc dialecte</w:t>
-      </w:r>
-    </w:p>
-    <w:p>
-      <w:proofErr w:type="spellStart"/>
-      <w:r>
-        <w:t>DialectBlock</w:t>
-      </w:r>
-      <w:proofErr w:type="spellEnd"/>
-    </w:p>
-    <w:p>
-      <w:r>
-        <w:t xml:space="preserve"> └─ </w:t>
-      </w:r>
-      <w:proofErr w:type="spellStart"/>
-      <w:r>
-        <w:t>lines</w:t>
-      </w:r>
-      <w:proofErr w:type="spellEnd"/>
-      <w:r>
-        <w:t>: Vec&lt;</w:t>
-      </w:r>
-      <w:proofErr w:type="spellStart"/>
-      <w:r>
-        <w:t>DialectLine</w:t>
-      </w:r>
-      <w:proofErr w:type="spellEnd"/>
-      <w:r>
-        <w:t>&gt;</w:t>
-      </w:r>
-    </w:p>
-    <w:p>
-      <w:proofErr w:type="spellStart"/>
-      <w:r>
-        <w:t>DialectLine</w:t>
-      </w:r>
-      <w:proofErr w:type="spellEnd"/>
-    </w:p>
-    <w:p>
-      <w:r>
-        <w:t xml:space="preserve"> </w:t>
-      </w:r>
-      <w:r>
-        <w:rPr>
-          <w:rFonts w:ascii="MS Gothic" w:eastAsia="MS Gothic" w:hAnsi="MS Gothic" w:cs="MS Gothic" w:hint="eastAsia"/>
-        </w:rPr>
-        <w:t>├</w:t>
-      </w:r>
-      <w:r>
-        <w:rPr>
-          <w:rFonts w:ascii="Aptos" w:hAnsi="Aptos" w:cs="Aptos"/>
-        </w:rPr>
-        <w:t>─</w:t>
-      </w:r>
-      <w:r>
-        <w:t xml:space="preserve"> command: </w:t>
-      </w:r>
-      <w:proofErr w:type="spellStart"/>
-      <w:r>
-        <w:t>KebabIdent</w:t>
-      </w:r>
-      <w:proofErr w:type="spellEnd"/>
-    </w:p>
-    <w:p>
-      <w:r>
+        <w:t>12.6 Intégration dans le parseur Rust</w:t>
+      </w:r>
+    </w:p>
+    <w:p>
+      <w:r>
+        <w:t>En Rust, tu peux viser une structure de ce genre :</w:t>
+      </w:r>
+    </w:p>
+    <w:p>
+      <w:pPr>
+        <w:rPr>
+          <w:lang w:val="en-GB"/>
+        </w:rPr>
+      </w:pPr>
+      <w:r>
+        <w:rPr>
+          <w:lang w:val="en-GB"/>
+        </w:rPr>
+        <w:t>enum Expr {</w:t>
+      </w:r>
+    </w:p>
+    <w:p>
+      <w:pPr>
+        <w:rPr>
+          <w:lang w:val="en-GB"/>
+        </w:rPr>
+      </w:pPr>
+      <w:r>
+        <w:rPr>
+          <w:lang w:val="en-GB"/>
+        </w:rPr>
+        <w:t xml:space="preserve">    Block(ExecutionBlock),</w:t>
+      </w:r>
+    </w:p>
+    <w:p>
+      <w:pPr>
+        <w:rPr>
+          <w:lang w:val="en-GB"/>
+        </w:rPr>
+      </w:pPr>
+      <w:r>
+        <w:rPr>
+          <w:lang w:val="en-GB"/>
+        </w:rPr>
+        <w:t xml:space="preserve">    Dialect(DialectBlock),</w:t>
+      </w:r>
+    </w:p>
+    <w:p>
+      <w:pPr>
+        <w:rPr>
+          <w:lang w:val="en-GB"/>
+        </w:rPr>
+      </w:pPr>
+      <w:r>
+        <w:rPr>
+          <w:lang w:val="en-GB"/>
+        </w:rPr>
+        <w:t xml:space="preserve">    Object(ObjectLiteral),</w:t>
+      </w:r>
+    </w:p>
+    <w:p>
+      <w:pPr>
+        <w:rPr>
+          <w:lang w:val="en-GB"/>
+        </w:rPr>
+      </w:pPr>
+      <w:r>
+        <w:rPr>
+          <w:lang w:val="en-GB"/>
+        </w:rPr>
+        <w:t xml:space="preserve">    ExplicitBlock(ExplicitBlock),</w:t>
+      </w:r>
+    </w:p>
+    <w:p>
+      <w:pPr>
+        <w:rPr>
+          <w:lang w:val="en-GB"/>
+        </w:rPr>
+      </w:pPr>
+      <w:r>
+        <w:rPr>
+          <w:lang w:val="en-GB"/>
+        </w:rPr>
+        <w:t xml:space="preserve">    Call(FunctionCall),</w:t>
+      </w:r>
+    </w:p>
+    <w:p>
+      <w:pPr>
+        <w:rPr>
+          <w:lang w:val="en-GB"/>
+        </w:rPr>
+      </w:pPr>
+      <w:r>
+        <w:rPr>
+          <w:lang w:val="en-GB"/>
+        </w:rPr>
+        <w:t xml:space="preserve">    Path(Path),</w:t>
+      </w:r>
+    </w:p>
+    <w:p>
+      <w:pPr>
+        <w:rPr>
+          <w:lang w:val="en-GB"/>
+        </w:rPr>
+      </w:pPr>
+      <w:r>
+        <w:rPr>
+          <w:lang w:val="en-GB"/>
+        </w:rPr>
+        <w:t xml:space="preserve">    Literal(Literal),</w:t>
+      </w:r>
+    </w:p>
+    <w:p>
+      <w:pPr>
+        <w:rPr>
+          <w:lang w:val="en-GB"/>
+        </w:rPr>
+      </w:pPr>
+      <w:r>
+        <w:rPr>
+          <w:lang w:val="en-GB"/>
+        </w:rPr>
+        <w:t xml:space="preserve">    // ...</w:t>
+      </w:r>
+    </w:p>
+    <w:p>
+      <w:pPr>
+        <w:rPr>
+          <w:lang w:val="en-GB"/>
+        </w:rPr>
+      </w:pPr>
+      <w:r>
+        <w:rPr>
+          <w:lang w:val="en-GB"/>
+        </w:rPr>
+        <w:t>}</w:t>
+      </w:r>
+    </w:p>
+    <w:p>
+      <w:pPr>
+        <w:rPr>
+          <w:lang w:val="en-GB"/>
+        </w:rPr>
+      </w:pPr>
+    </w:p>
+    <w:p>
+      <w:pPr>
+        <w:rPr>
+          <w:lang w:val="en-GB"/>
+        </w:rPr>
+      </w:pPr>
+      <w:r>
+        <w:rPr>
+          <w:lang w:val="en-GB"/>
+        </w:rPr>
+        <w:t>struct ExecutionBlock {</w:t>
+      </w:r>
+    </w:p>
+    <w:p>
+      <w:pPr>
+        <w:rPr>
+          <w:lang w:val="en-GB"/>
+        </w:rPr>
+      </w:pPr>
+      <w:r>
+        <w:rPr>
+          <w:lang w:val="en-GB"/>
+        </w:rPr>
+        <w:t xml:space="preserve">    pub statements: Vec&lt;Stmt&gt;,</w:t>
+      </w:r>
+    </w:p>
+    <w:p>
+      <w:pPr>
+        <w:rPr>
+          <w:lang w:val="en-GB"/>
+        </w:rPr>
+      </w:pPr>
+      <w:r>
+        <w:rPr>
+          <w:lang w:val="en-GB"/>
+        </w:rPr>
+        <w:t xml:space="preserve">    pub value: Box&lt;Expr&gt;,</w:t>
+      </w:r>
+    </w:p>
+    <w:p>
+      <w:pPr>
+        <w:rPr>
+          <w:lang w:val="en-GB"/>
+        </w:rPr>
+      </w:pPr>
+      <w:r>
+        <w:rPr>
+          <w:lang w:val="en-GB"/>
+        </w:rPr>
+        <w:t>}</w:t>
+      </w:r>
+    </w:p>
+    <w:p>
+      <w:pPr>
+        <w:rPr>
+          <w:lang w:val="en-GB"/>
+        </w:rPr>
+      </w:pPr>
+    </w:p>
+    <w:p>
+      <w:pPr>
+        <w:rPr>
+          <w:lang w:val="en-GB"/>
+        </w:rPr>
+      </w:pPr>
+      <w:r>
+        <w:rPr>
+          <w:lang w:val="en-GB"/>
+        </w:rPr>
+        <w:t>struct DialectBlock {</w:t>
+      </w:r>
+    </w:p>
+    <w:p>
+      <w:pPr>
+        <w:rPr>
+          <w:lang w:val="en-GB"/>
+        </w:rPr>
+      </w:pPr>
+      <w:r>
+        <w:rPr>
+          <w:lang w:val="en-GB"/>
+        </w:rPr>
+        <w:t xml:space="preserve">    pub lines: Vec&lt;DialectLine&gt;,</w:t>
+      </w:r>
+    </w:p>
+    <w:p>
+      <w:pPr>
+        <w:rPr>
+          <w:lang w:val="en-GB"/>
+        </w:rPr>
+      </w:pPr>
+      <w:r>
+        <w:rPr>
+          <w:lang w:val="en-GB"/>
+        </w:rPr>
+        <w:t>}</w:t>
+      </w:r>
+    </w:p>
+    <w:p>
+      <w:pPr>
+        <w:rPr>
+          <w:lang w:val="en-GB"/>
+        </w:rPr>
+      </w:pPr>
+    </w:p>
+    <w:p>
+      <w:pPr>
+        <w:rPr>
+          <w:lang w:val="en-GB"/>
+        </w:rPr>
+      </w:pPr>
+      <w:r>
+        <w:rPr>
+          <w:lang w:val="en-GB"/>
+        </w:rPr>
+        <w:t>struct ObjectLiteral {</w:t>
+      </w:r>
+    </w:p>
+    <w:p>
+      <w:pPr>
+        <w:rPr>
+          <w:lang w:val="en-GB"/>
+        </w:rPr>
+      </w:pPr>
+      <w:r>
+        <w:rPr>
+          <w:lang w:val="en-GB"/>
+        </w:rPr>
+        <w:t xml:space="preserve">    pub fields: Vec&lt;ObjectField&gt;,</w:t>
+      </w:r>
+    </w:p>
+    <w:p>
+      <w:pPr>
+        <w:rPr>
+          <w:lang w:val="en-GB"/>
+        </w:rPr>
+      </w:pPr>
+      <w:r>
+        <w:rPr>
+          <w:lang w:val="en-GB"/>
+        </w:rPr>
         <w:lastRenderedPageBreak/>
-        <w:t xml:space="preserve"> └─ args: Vec&lt;</w:t>
-      </w:r>
-      <w:proofErr w:type="spellStart"/>
-      <w:r>
-        <w:t>DialectArg</w:t>
-      </w:r>
-      <w:proofErr w:type="spellEnd"/>
-      <w:r>
-        <w:t>&gt;</w:t>
-      </w:r>
-    </w:p>
-    <w:p>
-      <w:pPr>
-        <w:rPr>
-          <w:lang w:val="en-GB"/>
-        </w:rPr>
-      </w:pPr>
-      <w:r>
-        <w:rPr>
-          <w:lang w:val="en-GB"/>
-        </w:rPr>
-        <w:t>DialectArg</w:t>
-      </w:r>
-    </w:p>
-    <w:p>
-      <w:pPr>
-        <w:rPr>
-          <w:lang w:val="en-GB"/>
-        </w:rPr>
-      </w:pPr>
-      <w:r>
-        <w:rPr>
-          <w:lang w:val="en-GB"/>
-        </w:rPr>
-        <w:t xml:space="preserve"> </w:t>
-      </w:r>
-      <w:r>
-        <w:rPr>
-          <w:rFonts w:ascii="MS Gothic" w:eastAsia="MS Gothic" w:hAnsi="MS Gothic" w:cs="MS Gothic" w:hint="eastAsia"/>
-          <w:lang w:val="en-GB"/>
-        </w:rPr>
-        <w:t>├</w:t>
-      </w:r>
-      <w:r>
-        <w:rPr>
-          <w:rFonts w:ascii="Aptos" w:hAnsi="Aptos" w:cs="Aptos"/>
-          <w:lang w:val="en-GB"/>
-        </w:rPr>
-        <w:t>─</w:t>
-      </w:r>
-      <w:r>
-        <w:rPr>
-          <w:lang w:val="en-GB"/>
-        </w:rPr>
-        <w:t xml:space="preserve"> Literal(Literal)</w:t>
-      </w:r>
-    </w:p>
-    <w:p>
-      <w:pPr>
-        <w:rPr>
-          <w:lang w:val="en-GB"/>
-        </w:rPr>
-      </w:pPr>
-      <w:r>
-        <w:rPr>
-          <w:lang w:val="en-GB"/>
-        </w:rPr>
-        <w:t xml:space="preserve"> </w:t>
-      </w:r>
-      <w:r>
-        <w:rPr>
-          <w:rFonts w:ascii="MS Gothic" w:eastAsia="MS Gothic" w:hAnsi="MS Gothic" w:cs="MS Gothic" w:hint="eastAsia"/>
-          <w:lang w:val="en-GB"/>
-        </w:rPr>
-        <w:t>├</w:t>
-      </w:r>
-      <w:r>
-        <w:rPr>
-          <w:rFonts w:ascii="Aptos" w:hAnsi="Aptos" w:cs="Aptos"/>
-          <w:lang w:val="en-GB"/>
-        </w:rPr>
-        <w:t>─</w:t>
-      </w:r>
-      <w:r>
-        <w:rPr>
-          <w:lang w:val="en-GB"/>
-        </w:rPr>
-        <w:t xml:space="preserve"> Path(Path)</w:t>
-      </w:r>
-    </w:p>
-    <w:p>
-      <w:r>
-        <w:rPr>
-          <w:lang w:val="en-GB"/>
-        </w:rPr>
-        <w:t xml:space="preserve"> </w:t>
-      </w:r>
-      <w:r>
-        <w:t xml:space="preserve">└─ </w:t>
-      </w:r>
-      <w:proofErr w:type="spellStart"/>
-      <w:r>
-        <w:t>Ident</w:t>
-      </w:r>
-      <w:proofErr w:type="spellEnd"/>
-      <w:r>
-        <w:t>(</w:t>
-      </w:r>
-      <w:proofErr w:type="spellStart"/>
-      <w:r>
-        <w:t>Ident</w:t>
-      </w:r>
-      <w:proofErr w:type="spellEnd"/>
-      <w:r>
-        <w:t>)</w:t>
-      </w:r>
-    </w:p>
-    <w:p>
-      <w:r>
-        <w:pict w14:anchorId="76C76EAC">
-          <v:rect id="_x0000_i1070" style="width:0;height:1.5pt" o:hralign="center" o:hrstd="t" o:hr="t" fillcolor="#a0a0a0" stroked="f"/>
-        </w:pict>
-      </w:r>
-    </w:p>
-    <w:p>
-      <w:pPr>
-        <w:rPr>
-          <w:b/>
-          <w:bCs/>
-          <w:lang w:val="en-GB"/>
-        </w:rPr>
-      </w:pPr>
-      <w:r>
-        <w:rPr>
-          <w:b/>
-          <w:bCs/>
-          <w:lang w:val="en-GB"/>
-        </w:rPr>
-        <w:t>12.4 Bloc objet</w:t>
-      </w:r>
-    </w:p>
-    <w:p>
-      <w:pPr>
-        <w:rPr>
-          <w:lang w:val="en-GB"/>
-        </w:rPr>
-      </w:pPr>
-      <w:r>
-        <w:rPr>
-          <w:lang w:val="en-GB"/>
-        </w:rPr>
-        <w:t>ObjectLiteral</w:t>
-      </w:r>
-    </w:p>
-    <w:p>
-      <w:pPr>
-        <w:rPr>
-          <w:lang w:val="en-GB"/>
-        </w:rPr>
-      </w:pPr>
-      <w:r>
-        <w:rPr>
-          <w:lang w:val="en-GB"/>
-        </w:rPr>
-        <w:t xml:space="preserve"> └─ fields: Vec&lt;ObjectField&gt;</w:t>
-      </w:r>
-    </w:p>
-    <w:p>
-      <w:pPr>
-        <w:rPr>
-          <w:lang w:val="en-GB"/>
-        </w:rPr>
-      </w:pPr>
-      <w:r>
-        <w:rPr>
-          <w:lang w:val="en-GB"/>
-        </w:rPr>
-        <w:t>ObjectField</w:t>
-      </w:r>
-    </w:p>
-    <w:p>
-      <w:pPr>
-        <w:rPr>
-          <w:lang w:val="en-GB"/>
-        </w:rPr>
-      </w:pPr>
-      <w:r>
-        <w:rPr>
-          <w:lang w:val="en-GB"/>
-        </w:rPr>
-        <w:t xml:space="preserve"> </w:t>
-      </w:r>
-      <w:r>
-        <w:rPr>
-          <w:rFonts w:ascii="MS Gothic" w:eastAsia="MS Gothic" w:hAnsi="MS Gothic" w:cs="MS Gothic" w:hint="eastAsia"/>
-          <w:lang w:val="en-GB"/>
-        </w:rPr>
-        <w:t>├</w:t>
-      </w:r>
-      <w:r>
-        <w:rPr>
-          <w:rFonts w:ascii="Aptos" w:hAnsi="Aptos" w:cs="Aptos"/>
-          <w:lang w:val="en-GB"/>
-        </w:rPr>
-        <w:t>─</w:t>
-      </w:r>
-      <w:r>
-        <w:rPr>
-          <w:lang w:val="en-GB"/>
-        </w:rPr>
-        <w:t xml:space="preserve"> Field {</w:t>
-      </w:r>
-    </w:p>
-    <w:p>
-      <w:pPr>
-        <w:rPr>
-          <w:lang w:val="en-GB"/>
-        </w:rPr>
-      </w:pPr>
-      <w:r>
-        <w:rPr>
-          <w:lang w:val="en-GB"/>
-        </w:rPr>
-        <w:t xml:space="preserve"> │    name: Ident,</w:t>
-      </w:r>
-    </w:p>
-    <w:p>
-      <w:pPr>
-        <w:rPr>
-          <w:lang w:val="en-GB"/>
-        </w:rPr>
-      </w:pPr>
-      <w:r>
-        <w:rPr>
-          <w:lang w:val="en-GB"/>
-        </w:rPr>
-        <w:t xml:space="preserve"> │    type_hint: Type,</w:t>
-      </w:r>
-    </w:p>
-    <w:p>
-      <w:pPr>
-        <w:rPr>
-          <w:lang w:val="en-GB"/>
-        </w:rPr>
-      </w:pPr>
-      <w:r>
-        <w:rPr>
-          <w:lang w:val="en-GB"/>
-        </w:rPr>
-        <w:t xml:space="preserve"> │    value: Expr</w:t>
-      </w:r>
-    </w:p>
-    <w:p>
-      <w:pPr>
-        <w:rPr>
-          <w:lang w:val="en-GB"/>
-        </w:rPr>
-      </w:pPr>
-      <w:r>
-        <w:rPr>
-          <w:lang w:val="en-GB"/>
-        </w:rPr>
-        <w:t xml:space="preserve"> │  }</w:t>
-      </w:r>
-    </w:p>
-    <w:p>
-      <w:pPr>
-        <w:rPr>
-          <w:lang w:val="en-GB"/>
-        </w:rPr>
-      </w:pPr>
-      <w:r>
-        <w:rPr>
-          <w:lang w:val="en-GB"/>
-        </w:rPr>
-        <w:t xml:space="preserve"> └─ Method {</w:t>
-      </w:r>
-    </w:p>
-    <w:p>
-      <w:pPr>
-        <w:rPr>
-          <w:lang w:val="en-GB"/>
-        </w:rPr>
-      </w:pPr>
-      <w:r>
-        <w:rPr>
-          <w:lang w:val="en-GB"/>
-        </w:rPr>
-        <w:t xml:space="preserve">      name: Ident,</w:t>
-      </w:r>
-    </w:p>
-    <w:p>
-      <w:pPr>
-        <w:rPr>
-          <w:lang w:val="en-GB"/>
-        </w:rPr>
-      </w:pPr>
-      <w:r>
-        <w:rPr>
-          <w:lang w:val="en-GB"/>
-        </w:rPr>
-        <w:t xml:space="preserve">      func: FunctionDef</w:t>
-      </w:r>
-    </w:p>
-    <w:p>
-      <w:pPr>
-        <w:rPr>
-          <w:lang w:val="en-GB"/>
-        </w:rPr>
-      </w:pPr>
-      <w:r>
-        <w:rPr>
-          <w:lang w:val="en-GB"/>
-        </w:rPr>
-        <w:t xml:space="preserve">    }</w:t>
-      </w:r>
-    </w:p>
-    <w:p>
-      <w:pPr>
-        <w:rPr>
-          <w:lang w:val="en-GB"/>
-        </w:rPr>
-      </w:pPr>
-      <w:r>
-        <w:rPr>
-          <w:lang w:val="en-GB"/>
-        </w:rPr>
-        <w:t>FunctionDef :</w:t>
-      </w:r>
-    </w:p>
-    <w:p>
-      <w:pPr>
-        <w:rPr>
-          <w:lang w:val="en-GB"/>
-        </w:rPr>
-      </w:pPr>
-      <w:r>
-        <w:rPr>
-          <w:lang w:val="en-GB"/>
-        </w:rPr>
-        <w:t>FunctionDef</w:t>
-      </w:r>
-    </w:p>
-    <w:p>
-      <w:pPr>
-        <w:rPr>
-          <w:lang w:val="en-GB"/>
-        </w:rPr>
-      </w:pPr>
-      <w:r>
-        <w:rPr>
-          <w:lang w:val="en-GB"/>
-        </w:rPr>
-        <w:t xml:space="preserve"> </w:t>
-      </w:r>
-      <w:r>
-        <w:rPr>
-          <w:rFonts w:ascii="MS Gothic" w:eastAsia="MS Gothic" w:hAnsi="MS Gothic" w:cs="MS Gothic" w:hint="eastAsia"/>
-          <w:lang w:val="en-GB"/>
-        </w:rPr>
-        <w:t>├</w:t>
-      </w:r>
-      <w:r>
-        <w:rPr>
-          <w:rFonts w:ascii="Aptos" w:hAnsi="Aptos" w:cs="Aptos"/>
-          <w:lang w:val="en-GB"/>
-        </w:rPr>
-        <w:t>─</w:t>
-      </w:r>
-      <w:r>
-        <w:rPr>
-          <w:lang w:val="en-GB"/>
-        </w:rPr>
-        <w:t xml:space="preserve"> params: Vec&lt;Param&gt;</w:t>
-      </w:r>
-    </w:p>
-    <w:p>
-      <w:pPr>
-        <w:rPr>
-          <w:lang w:val="en-GB"/>
-        </w:rPr>
-      </w:pPr>
-      <w:r>
-        <w:rPr>
-          <w:lang w:val="en-GB"/>
-        </w:rPr>
-        <w:t xml:space="preserve"> </w:t>
-      </w:r>
-      <w:r>
-        <w:rPr>
-          <w:rFonts w:ascii="MS Gothic" w:eastAsia="MS Gothic" w:hAnsi="MS Gothic" w:cs="MS Gothic" w:hint="eastAsia"/>
-          <w:lang w:val="en-GB"/>
-        </w:rPr>
-        <w:t>├</w:t>
-      </w:r>
-      <w:r>
-        <w:rPr>
-          <w:rFonts w:ascii="Aptos" w:hAnsi="Aptos" w:cs="Aptos"/>
-          <w:lang w:val="en-GB"/>
-        </w:rPr>
-        <w:t>─</w:t>
-      </w:r>
-      <w:r>
-        <w:rPr>
-          <w:lang w:val="en-GB"/>
-        </w:rPr>
-        <w:t xml:space="preserve"> return_type: Option&lt;Type&gt;</w:t>
-      </w:r>
-    </w:p>
-    <w:p>
-      <w:pPr>
-        <w:rPr>
-          <w:lang w:val="en-GB"/>
-        </w:rPr>
-      </w:pPr>
-      <w:r>
-        <w:rPr>
-          <w:lang w:val="en-GB"/>
-        </w:rPr>
-        <w:t xml:space="preserve"> └─ body: ExecutionBlock</w:t>
-      </w:r>
-    </w:p>
-    <w:p>
-      <w:r>
-        <w:pict w14:anchorId="5BEDB4F8">
-          <v:rect id="_x0000_i1071" style="width:0;height:1.5pt" o:hralign="center" o:hrstd="t" o:hr="t" fillcolor="#a0a0a0" stroked="f"/>
-        </w:pict>
-      </w:r>
-    </w:p>
-    <w:p>
-      <w:pPr>
-        <w:rPr>
-          <w:b/>
-          <w:bCs/>
-        </w:rPr>
-      </w:pPr>
-      <w:r>
-        <w:rPr>
-          <w:b/>
-          <w:bCs/>
-        </w:rPr>
-        <w:t>12.5 Bloc explicite</w:t>
-      </w:r>
-    </w:p>
-    <w:p>
-      <w:proofErr w:type="spellStart"/>
-      <w:r>
-        <w:t>ExplicitBlock</w:t>
-      </w:r>
-      <w:proofErr w:type="spellEnd"/>
-    </w:p>
-    <w:p>
-      <w:r>
-        <w:t xml:space="preserve"> └─ body: </w:t>
-      </w:r>
-      <w:proofErr w:type="spellStart"/>
-      <w:r>
-        <w:t>ExecutionBlock</w:t>
-      </w:r>
-      <w:proofErr w:type="spellEnd"/>
-    </w:p>
-    <w:p>
-      <w:r>
-        <w:lastRenderedPageBreak/>
-        <w:t xml:space="preserve">Dans l’AST, un bloc explicite est donc un nœud distinct, mais réutilise la même structure interne que </w:t>
-      </w:r>
-      <w:proofErr w:type="spellStart"/>
-      <w:r>
-        <w:t>ExecutionBlock</w:t>
-      </w:r>
-      <w:proofErr w:type="spellEnd"/>
-      <w:r>
-        <w:t>.</w:t>
-      </w:r>
-    </w:p>
-    <w:p>
-      <w:r>
-        <w:pict w14:anchorId="49446AEE">
-          <v:rect id="_x0000_i1072" style="width:0;height:1.5pt" o:hralign="center" o:hrstd="t" o:hr="t" fillcolor="#a0a0a0" stroked="f"/>
-        </w:pict>
-      </w:r>
-    </w:p>
-    <w:p>
-      <w:pPr>
-        <w:rPr>
-          <w:b/>
-          <w:bCs/>
-        </w:rPr>
-      </w:pPr>
-      <w:r>
-        <w:rPr>
-          <w:b/>
-          <w:bCs/>
-        </w:rPr>
-        <w:t>12.6 Intégration dans le parseur Rust</w:t>
-      </w:r>
-    </w:p>
-    <w:p>
-      <w:r>
-        <w:t>En Rust, tu peux viser une structure de ce genre :</w:t>
-      </w:r>
-    </w:p>
-    <w:p>
-      <w:pPr>
-        <w:rPr>
-          <w:lang w:val="en-GB"/>
-        </w:rPr>
-      </w:pPr>
-      <w:r>
-        <w:rPr>
-          <w:lang w:val="en-GB"/>
-        </w:rPr>
-        <w:t>enum Expr {</w:t>
-      </w:r>
-    </w:p>
-    <w:p>
-      <w:pPr>
-        <w:rPr>
-          <w:lang w:val="en-GB"/>
-        </w:rPr>
-      </w:pPr>
-      <w:r>
-        <w:rPr>
-          <w:lang w:val="en-GB"/>
-        </w:rPr>
-        <w:t xml:space="preserve">    Block(ExecutionBlock),</w:t>
-      </w:r>
-    </w:p>
-    <w:p>
-      <w:pPr>
-        <w:rPr>
-          <w:lang w:val="en-GB"/>
-        </w:rPr>
-      </w:pPr>
-      <w:r>
-        <w:rPr>
-          <w:lang w:val="en-GB"/>
-        </w:rPr>
-        <w:t xml:space="preserve">    Dialect(DialectBlock),</w:t>
-      </w:r>
-    </w:p>
-    <w:p>
-      <w:pPr>
-        <w:rPr>
-          <w:lang w:val="en-GB"/>
-        </w:rPr>
-      </w:pPr>
-      <w:r>
-        <w:rPr>
-          <w:lang w:val="en-GB"/>
-        </w:rPr>
-        <w:t xml:space="preserve">    Object(ObjectLiteral),</w:t>
-      </w:r>
-    </w:p>
-    <w:p>
-      <w:pPr>
-        <w:rPr>
-          <w:lang w:val="en-GB"/>
-        </w:rPr>
-      </w:pPr>
-      <w:r>
-        <w:rPr>
-          <w:lang w:val="en-GB"/>
-        </w:rPr>
-        <w:t xml:space="preserve">    ExplicitBlock(ExplicitBlock),</w:t>
-      </w:r>
-    </w:p>
-    <w:p>
-      <w:pPr>
-        <w:rPr>
-          <w:lang w:val="en-GB"/>
-        </w:rPr>
-      </w:pPr>
-      <w:r>
-        <w:rPr>
-          <w:lang w:val="en-GB"/>
-        </w:rPr>
-        <w:t xml:space="preserve">    Call(FunctionCall),</w:t>
-      </w:r>
-    </w:p>
-    <w:p>
-      <w:pPr>
-        <w:rPr>
-          <w:lang w:val="en-GB"/>
-        </w:rPr>
-      </w:pPr>
-      <w:r>
-        <w:rPr>
-          <w:lang w:val="en-GB"/>
-        </w:rPr>
-        <w:t xml:space="preserve">    Path(Path),</w:t>
-      </w:r>
-    </w:p>
-    <w:p>
-      <w:pPr>
-        <w:rPr>
-          <w:lang w:val="en-GB"/>
-        </w:rPr>
-      </w:pPr>
-      <w:r>
-        <w:rPr>
-          <w:lang w:val="en-GB"/>
-        </w:rPr>
-        <w:t xml:space="preserve">    Literal(Literal),</w:t>
-      </w:r>
-    </w:p>
-    <w:p>
-      <w:pPr>
-        <w:rPr>
-          <w:lang w:val="en-GB"/>
-        </w:rPr>
-      </w:pPr>
-      <w:r>
-        <w:rPr>
-          <w:lang w:val="en-GB"/>
-        </w:rPr>
-        <w:t xml:space="preserve">    // ...</w:t>
-      </w:r>
-    </w:p>
-    <w:p>
-      <w:pPr>
-        <w:rPr>
-          <w:lang w:val="en-GB"/>
-        </w:rPr>
-      </w:pPr>
-      <w:r>
-        <w:rPr>
-          <w:lang w:val="en-GB"/>
-        </w:rPr>
-        <w:t>}</w:t>
-      </w:r>
-    </w:p>
-    <w:p>
-      <w:pPr>
-        <w:rPr>
-          <w:lang w:val="en-GB"/>
-        </w:rPr>
-      </w:pPr>
-    </w:p>
-    <w:p>
-      <w:pPr>
-        <w:rPr>
-          <w:lang w:val="en-GB"/>
-        </w:rPr>
-      </w:pPr>
-      <w:r>
-        <w:rPr>
-          <w:lang w:val="en-GB"/>
-        </w:rPr>
-        <w:t>struct ExecutionBlock {</w:t>
-      </w:r>
-    </w:p>
-    <w:p>
-      <w:pPr>
-        <w:rPr>
-          <w:lang w:val="en-GB"/>
-        </w:rPr>
-      </w:pPr>
-      <w:r>
-        <w:rPr>
-          <w:lang w:val="en-GB"/>
-        </w:rPr>
-        <w:t xml:space="preserve">    pub statements: Vec&lt;Stmt&gt;,</w:t>
-      </w:r>
-    </w:p>
-    <w:p>
-      <w:pPr>
-        <w:rPr>
-          <w:lang w:val="en-GB"/>
-        </w:rPr>
-      </w:pPr>
-      <w:r>
-        <w:rPr>
-          <w:lang w:val="en-GB"/>
-        </w:rPr>
-        <w:t xml:space="preserve">    pub value: Box&lt;Expr&gt;,</w:t>
-      </w:r>
-    </w:p>
-    <w:p>
-      <w:pPr>
-        <w:rPr>
-          <w:lang w:val="en-GB"/>
-        </w:rPr>
-      </w:pPr>
-      <w:r>
-        <w:rPr>
-          <w:lang w:val="en-GB"/>
-        </w:rPr>
-        <w:t>}</w:t>
-      </w:r>
-    </w:p>
-    <w:p>
-      <w:pPr>
-        <w:rPr>
-          <w:lang w:val="en-GB"/>
-        </w:rPr>
-      </w:pPr>
-    </w:p>
-    <w:p>
-      <w:pPr>
-        <w:rPr>
-          <w:lang w:val="en-GB"/>
-        </w:rPr>
-      </w:pPr>
-      <w:r>
-        <w:rPr>
-          <w:lang w:val="en-GB"/>
-        </w:rPr>
-        <w:t>struct DialectBlock {</w:t>
-      </w:r>
-    </w:p>
-    <w:p>
-      <w:pPr>
-        <w:rPr>
-          <w:lang w:val="en-GB"/>
-        </w:rPr>
-      </w:pPr>
-      <w:r>
-        <w:rPr>
-          <w:lang w:val="en-GB"/>
-        </w:rPr>
-        <w:t xml:space="preserve">    pub lines: Vec&lt;DialectLine&gt;,</w:t>
-      </w:r>
-    </w:p>
-    <w:p>
-      <w:pPr>
-        <w:rPr>
-          <w:lang w:val="en-GB"/>
-        </w:rPr>
-      </w:pPr>
-      <w:r>
-        <w:rPr>
-          <w:lang w:val="en-GB"/>
-        </w:rPr>
-        <w:t>}</w:t>
-      </w:r>
-    </w:p>
-    <w:p>
-      <w:pPr>
-        <w:rPr>
-          <w:lang w:val="en-GB"/>
-        </w:rPr>
-      </w:pPr>
-    </w:p>
-    <w:p>
-      <w:pPr>
-        <w:rPr>
-          <w:lang w:val="en-GB"/>
-        </w:rPr>
-      </w:pPr>
-      <w:r>
-        <w:rPr>
-          <w:lang w:val="en-GB"/>
-        </w:rPr>
-        <w:t>struct ObjectLiteral {</w:t>
-      </w:r>
-    </w:p>
-    <w:p>
-      <w:pPr>
-        <w:rPr>
-          <w:lang w:val="en-GB"/>
-        </w:rPr>
-      </w:pPr>
-      <w:r>
-        <w:rPr>
-          <w:lang w:val="en-GB"/>
-        </w:rPr>
-        <w:t xml:space="preserve">    pub fields: Vec&lt;ObjectField&gt;,</w:t>
-      </w:r>
-    </w:p>
-    <w:p>
-      <w:pPr>
-        <w:rPr>
-          <w:lang w:val="en-GB"/>
-        </w:rPr>
-      </w:pPr>
-      <w:r>
-        <w:rPr>
-          <w:lang w:val="en-GB"/>
-        </w:rPr>
         <w:t>}</w:t>
       </w:r>
     </w:p>

</xml_diff>